<commit_message>
Correcciones de Código y Avance de la Documentación Externa
Se borraron dos funciones repetidas y se ordenó un poco el programa, también se agregaron unas lineas al juego "Revoltijo de Palabras" para que el jugador no perdiera intentos al enviar una respuesta vacía.
</commit_message>
<xml_diff>
--- a/Documentación Externa del Proyecto.docx
+++ b/Documentación Externa del Proyecto.docx
@@ -56,13 +56,11 @@
         <w:spacing w:before="120" w:after="120"/>
         <w:jc w:val="center"/>
         <w:rPr>
-          <w:color w:val="auto"/>
-          <w:lang w:val="es-CR" w:eastAsia="es-ES_tradnl" w:bidi="ar-SA"/>
-        </w:rPr>
-      </w:pPr>
-      <w:r>
-        <w:rPr>
-          <w:color w:val="auto"/>
+          <w:lang w:val="es-CR" w:eastAsia="es-ES_tradnl" w:bidi="ar-SA"/>
+        </w:rPr>
+      </w:pPr>
+      <w:r>
+        <w:rPr>
           <w:lang w:val="es-CR" w:eastAsia="es-ES_tradnl" w:bidi="ar-SA"/>
         </w:rPr>
         <w:drawing>
@@ -135,7 +133,6 @@
         <w:spacing w:before="120" w:after="120"/>
         <w:jc w:val="center"/>
         <w:rPr>
-          <w:color w:val="auto"/>
           <w:lang w:val="es-CR" w:eastAsia="es-ES_tradnl" w:bidi="ar-SA"/>
         </w:rPr>
       </w:pPr>
@@ -157,7 +154,6 @@
         <w:spacing w:before="120" w:after="120"/>
         <w:jc w:val="center"/>
         <w:rPr>
-          <w:color w:val="auto"/>
           <w:lang w:val="es-CR" w:eastAsia="es-ES_tradnl" w:bidi="ar-SA"/>
         </w:rPr>
       </w:pPr>
@@ -177,7 +173,6 @@
         <w:spacing w:before="120" w:after="120"/>
         <w:jc w:val="center"/>
         <w:rPr>
-          <w:color w:val="auto"/>
           <w:lang w:val="es-CR" w:eastAsia="es-ES_tradnl" w:bidi="ar-SA"/>
         </w:rPr>
       </w:pPr>
@@ -227,7 +222,6 @@
         <w:spacing w:before="120" w:after="120"/>
         <w:jc w:val="center"/>
         <w:rPr>
-          <w:color w:val="auto"/>
           <w:lang w:val="es-CR" w:eastAsia="es-ES_tradnl" w:bidi="ar-SA"/>
         </w:rPr>
       </w:pPr>
@@ -265,7 +259,6 @@
         <w:spacing w:before="120" w:after="120"/>
         <w:jc w:val="center"/>
         <w:rPr>
-          <w:color w:val="auto"/>
           <w:lang w:val="es-CR" w:eastAsia="es-ES_tradnl" w:bidi="ar-SA"/>
         </w:rPr>
       </w:pPr>
@@ -317,7 +310,6 @@
         <w:spacing w:before="120" w:after="120"/>
         <w:jc w:val="center"/>
         <w:rPr>
-          <w:color w:val="auto"/>
           <w:lang w:val="es-CR" w:eastAsia="es-ES_tradnl" w:bidi="ar-SA"/>
         </w:rPr>
       </w:pPr>
@@ -335,7 +327,6 @@
         <w:spacing w:before="120" w:after="120"/>
         <w:jc w:val="center"/>
         <w:rPr>
-          <w:color w:val="auto"/>
           <w:lang w:val="es-CR" w:eastAsia="es-ES_tradnl" w:bidi="ar-SA"/>
         </w:rPr>
       </w:pPr>
@@ -401,7 +392,6 @@
         <w:spacing w:before="120" w:after="120"/>
         <w:jc w:val="center"/>
         <w:rPr>
-          <w:color w:val="auto"/>
           <w:lang w:val="es-CR" w:eastAsia="es-ES_tradnl" w:bidi="ar-SA"/>
         </w:rPr>
       </w:pPr>
@@ -421,7 +411,6 @@
         <w:spacing w:before="120" w:after="120"/>
         <w:jc w:val="center"/>
         <w:rPr>
-          <w:color w:val="auto"/>
           <w:lang w:val="es-CR" w:eastAsia="es-ES_tradnl" w:bidi="ar-SA"/>
         </w:rPr>
       </w:pPr>
@@ -439,7 +428,6 @@
         <w:spacing w:before="120" w:after="120"/>
         <w:jc w:val="center"/>
         <w:rPr>
-          <w:color w:val="auto"/>
           <w:lang w:val="es-CR" w:eastAsia="es-ES_tradnl" w:bidi="ar-SA"/>
         </w:rPr>
       </w:pPr>
@@ -457,23 +445,15 @@
         <w:spacing w:before="120" w:after="120"/>
         <w:jc w:val="center"/>
         <w:rPr>
-          <w:color w:val="auto"/>
-          <w:lang w:val="es-CR" w:eastAsia="es-ES_tradnl" w:bidi="ar-SA"/>
-        </w:rPr>
-      </w:pPr>
-      <w:r>
-        <w:rPr>
-          <w:color w:val="auto"/>
-          <w:lang w:val="es-CR" w:eastAsia="es-ES_tradnl" w:bidi="ar-SA"/>
-        </w:rPr>
-        <w:t xml:space="preserve">Isaac Salas </w:t>
-      </w:r>
-      <w:r>
-        <w:rPr>
-          <w:color w:val="auto"/>
-          <w:lang w:val="es-CR" w:eastAsia="es-ES_tradnl" w:bidi="ar-SA"/>
-        </w:rPr>
-        <w:t>Su.</w:t>
+          <w:lang w:val="es-CR" w:eastAsia="es-ES_tradnl" w:bidi="ar-SA"/>
+        </w:rPr>
+      </w:pPr>
+      <w:r>
+        <w:rPr>
+          <w:color w:val="auto"/>
+          <w:lang w:val="es-CR" w:eastAsia="es-ES_tradnl" w:bidi="ar-SA"/>
+        </w:rPr>
+        <w:t>Isaac Salas Su.</w:t>
       </w:r>
     </w:p>
     <w:p>
@@ -514,7 +494,6 @@
         <w:spacing w:before="120" w:after="120"/>
         <w:jc w:val="center"/>
         <w:rPr>
-          <w:color w:val="auto"/>
           <w:lang w:val="es-CR" w:eastAsia="es-ES_tradnl" w:bidi="ar-SA"/>
         </w:rPr>
       </w:pPr>
@@ -532,7 +511,6 @@
         <w:spacing w:before="120" w:after="120"/>
         <w:jc w:val="center"/>
         <w:rPr>
-          <w:color w:val="auto"/>
           <w:lang w:val="es-CR" w:eastAsia="es-ES_tradnl" w:bidi="ar-SA"/>
         </w:rPr>
       </w:pPr>
@@ -605,7 +583,7 @@
         <w:gridCol w:w="3360"/>
         <w:gridCol w:w="1999"/>
         <w:gridCol w:w="2001"/>
-        <w:gridCol w:w="2130"/>
+        <w:gridCol w:w="2129"/>
       </w:tblGrid>
       <w:tr>
         <w:trPr>
@@ -628,7 +606,6 @@
               <w:pStyle w:val="Normal"/>
               <w:jc w:val="center"/>
               <w:rPr>
-                <w:color w:val="auto"/>
                 <w:lang w:val="es-CR" w:eastAsia="es-ES_tradnl" w:bidi="ar-SA"/>
               </w:rPr>
             </w:pPr>
@@ -662,7 +639,6 @@
               <w:pStyle w:val="Normal"/>
               <w:jc w:val="center"/>
               <w:rPr>
-                <w:color w:val="auto"/>
                 <w:lang w:val="es-CR" w:eastAsia="es-ES_tradnl" w:bidi="ar-SA"/>
               </w:rPr>
             </w:pPr>
@@ -696,7 +672,6 @@
               <w:pStyle w:val="Normal"/>
               <w:jc w:val="center"/>
               <w:rPr>
-                <w:color w:val="auto"/>
                 <w:lang w:val="es-CR" w:eastAsia="es-ES_tradnl" w:bidi="ar-SA"/>
               </w:rPr>
             </w:pPr>
@@ -715,7 +690,7 @@
         </w:tc>
         <w:tc>
           <w:tcPr>
-            <w:tcW w:w="2130" w:type="dxa"/>
+            <w:tcW w:w="2129" w:type="dxa"/>
             <w:tcBorders>
               <w:top w:val="single" w:sz="4" w:space="0" w:color="AAAAAA"/>
               <w:left w:val="single" w:sz="4" w:space="0" w:color="AAAAAA"/>
@@ -730,7 +705,6 @@
               <w:pStyle w:val="Normal"/>
               <w:jc w:val="center"/>
               <w:rPr>
-                <w:color w:val="auto"/>
                 <w:lang w:val="es-CR" w:eastAsia="es-ES_tradnl" w:bidi="ar-SA"/>
               </w:rPr>
             </w:pPr>
@@ -768,7 +742,6 @@
             <w:pPr>
               <w:pStyle w:val="Normal"/>
               <w:rPr>
-                <w:color w:val="auto"/>
                 <w:lang w:val="es-CR" w:eastAsia="es-ES_tradnl" w:bidi="ar-SA"/>
               </w:rPr>
             </w:pPr>
@@ -802,9 +775,6 @@
               <w:pStyle w:val="Normal"/>
               <w:jc w:val="center"/>
               <w:rPr>
-                <w:color w:val="auto"/>
-                <w:sz w:val="20"/>
-                <w:szCs w:val="20"/>
                 <w:lang w:val="es-CR" w:eastAsia="es-ES_tradnl" w:bidi="ar-SA"/>
               </w:rPr>
             </w:pPr>
@@ -854,7 +824,7 @@
         </w:tc>
         <w:tc>
           <w:tcPr>
-            <w:tcW w:w="2130" w:type="dxa"/>
+            <w:tcW w:w="2129" w:type="dxa"/>
             <w:tcBorders>
               <w:top w:val="single" w:sz="4" w:space="0" w:color="AAAAAA"/>
               <w:left w:val="single" w:sz="4" w:space="0" w:color="AAAAAA"/>
@@ -906,7 +876,6 @@
             <w:pPr>
               <w:pStyle w:val="Normal"/>
               <w:rPr>
-                <w:color w:val="auto"/>
                 <w:lang w:val="es-CR" w:eastAsia="es-ES_tradnl" w:bidi="ar-SA"/>
               </w:rPr>
             </w:pPr>
@@ -991,7 +960,7 @@
         </w:tc>
         <w:tc>
           <w:tcPr>
-            <w:tcW w:w="2130" w:type="dxa"/>
+            <w:tcW w:w="2129" w:type="dxa"/>
             <w:tcBorders>
               <w:top w:val="single" w:sz="4" w:space="0" w:color="AAAAAA"/>
               <w:left w:val="single" w:sz="4" w:space="0" w:color="AAAAAA"/>
@@ -1006,9 +975,6 @@
               <w:pStyle w:val="Normal"/>
               <w:jc w:val="center"/>
               <w:rPr>
-                <w:color w:val="auto"/>
-                <w:sz w:val="20"/>
-                <w:szCs w:val="20"/>
                 <w:lang w:val="es-CR" w:eastAsia="es-ES_tradnl" w:bidi="ar-SA"/>
               </w:rPr>
             </w:pPr>
@@ -1044,7 +1010,6 @@
             <w:pPr>
               <w:pStyle w:val="Normal"/>
               <w:rPr>
-                <w:color w:val="auto"/>
                 <w:lang w:val="es-CR" w:eastAsia="es-ES_tradnl" w:bidi="ar-SA"/>
               </w:rPr>
             </w:pPr>
@@ -1078,9 +1043,6 @@
               <w:pStyle w:val="Normal"/>
               <w:jc w:val="center"/>
               <w:rPr>
-                <w:color w:val="auto"/>
-                <w:sz w:val="20"/>
-                <w:szCs w:val="20"/>
                 <w:lang w:val="es-CR" w:eastAsia="es-ES_tradnl" w:bidi="ar-SA"/>
               </w:rPr>
             </w:pPr>
@@ -1130,7 +1092,7 @@
         </w:tc>
         <w:tc>
           <w:tcPr>
-            <w:tcW w:w="2130" w:type="dxa"/>
+            <w:tcW w:w="2129" w:type="dxa"/>
             <w:tcBorders>
               <w:top w:val="single" w:sz="4" w:space="0" w:color="AAAAAA"/>
               <w:left w:val="single" w:sz="4" w:space="0" w:color="AAAAAA"/>
@@ -1182,7 +1144,6 @@
             <w:pPr>
               <w:pStyle w:val="Normal"/>
               <w:rPr>
-                <w:color w:val="auto"/>
                 <w:lang w:val="es-CR" w:eastAsia="es-ES_tradnl" w:bidi="ar-SA"/>
               </w:rPr>
             </w:pPr>
@@ -1216,9 +1177,6 @@
               <w:pStyle w:val="Normal"/>
               <w:jc w:val="center"/>
               <w:rPr>
-                <w:color w:val="auto"/>
-                <w:sz w:val="20"/>
-                <w:szCs w:val="20"/>
                 <w:lang w:val="es-CR" w:eastAsia="es-ES_tradnl" w:bidi="ar-SA"/>
               </w:rPr>
             </w:pPr>
@@ -1268,7 +1226,7 @@
         </w:tc>
         <w:tc>
           <w:tcPr>
-            <w:tcW w:w="2130" w:type="dxa"/>
+            <w:tcW w:w="2129" w:type="dxa"/>
             <w:tcBorders>
               <w:top w:val="single" w:sz="4" w:space="0" w:color="AAAAAA"/>
               <w:left w:val="single" w:sz="4" w:space="0" w:color="AAAAAA"/>
@@ -1320,7 +1278,6 @@
             <w:pPr>
               <w:pStyle w:val="Normal"/>
               <w:rPr>
-                <w:color w:val="auto"/>
                 <w:lang w:val="es-CR" w:eastAsia="es-ES_tradnl" w:bidi="ar-SA"/>
               </w:rPr>
             </w:pPr>
@@ -1387,9 +1344,6 @@
               <w:pStyle w:val="Normal"/>
               <w:jc w:val="center"/>
               <w:rPr>
-                <w:color w:val="auto"/>
-                <w:sz w:val="20"/>
-                <w:szCs w:val="20"/>
                 <w:lang w:val="es-CR" w:eastAsia="es-ES_tradnl" w:bidi="ar-SA"/>
               </w:rPr>
             </w:pPr>
@@ -1406,7 +1360,7 @@
         </w:tc>
         <w:tc>
           <w:tcPr>
-            <w:tcW w:w="2130" w:type="dxa"/>
+            <w:tcW w:w="2129" w:type="dxa"/>
             <w:tcBorders>
               <w:top w:val="single" w:sz="4" w:space="0" w:color="AAAAAA"/>
               <w:left w:val="single" w:sz="4" w:space="0" w:color="AAAAAA"/>
@@ -1458,7 +1412,6 @@
             <w:pPr>
               <w:pStyle w:val="Normal"/>
               <w:rPr>
-                <w:color w:val="auto"/>
                 <w:lang w:val="es-CR" w:eastAsia="es-ES_tradnl" w:bidi="ar-SA"/>
               </w:rPr>
             </w:pPr>
@@ -1492,9 +1445,6 @@
               <w:pStyle w:val="Normal"/>
               <w:jc w:val="center"/>
               <w:rPr>
-                <w:color w:val="auto"/>
-                <w:sz w:val="20"/>
-                <w:szCs w:val="20"/>
                 <w:lang w:val="es-CR" w:eastAsia="es-ES_tradnl" w:bidi="ar-SA"/>
               </w:rPr>
             </w:pPr>
@@ -1526,9 +1476,6 @@
               <w:pStyle w:val="Normal"/>
               <w:jc w:val="center"/>
               <w:rPr>
-                <w:color w:val="auto"/>
-                <w:sz w:val="20"/>
-                <w:szCs w:val="20"/>
                 <w:lang w:val="es-CR" w:eastAsia="es-ES_tradnl" w:bidi="ar-SA"/>
               </w:rPr>
             </w:pPr>
@@ -1545,7 +1492,7 @@
         </w:tc>
         <w:tc>
           <w:tcPr>
-            <w:tcW w:w="2130" w:type="dxa"/>
+            <w:tcW w:w="2129" w:type="dxa"/>
             <w:tcBorders>
               <w:top w:val="single" w:sz="4" w:space="0" w:color="AAAAAA"/>
               <w:left w:val="single" w:sz="4" w:space="0" w:color="AAAAAA"/>
@@ -1597,7 +1544,6 @@
             <w:pPr>
               <w:pStyle w:val="Normal"/>
               <w:rPr>
-                <w:color w:val="auto"/>
                 <w:lang w:val="es-CR" w:eastAsia="es-ES_tradnl" w:bidi="ar-SA"/>
               </w:rPr>
             </w:pPr>
@@ -1631,9 +1577,6 @@
               <w:pStyle w:val="Normal"/>
               <w:jc w:val="center"/>
               <w:rPr>
-                <w:color w:val="auto"/>
-                <w:sz w:val="20"/>
-                <w:szCs w:val="20"/>
                 <w:lang w:val="es-CR" w:eastAsia="es-ES_tradnl" w:bidi="ar-SA"/>
               </w:rPr>
             </w:pPr>
@@ -1665,9 +1608,6 @@
               <w:pStyle w:val="Normal"/>
               <w:jc w:val="center"/>
               <w:rPr>
-                <w:color w:val="auto"/>
-                <w:sz w:val="20"/>
-                <w:szCs w:val="20"/>
                 <w:lang w:val="es-CR" w:eastAsia="es-ES_tradnl" w:bidi="ar-SA"/>
               </w:rPr>
             </w:pPr>
@@ -1684,7 +1624,7 @@
         </w:tc>
         <w:tc>
           <w:tcPr>
-            <w:tcW w:w="2130" w:type="dxa"/>
+            <w:tcW w:w="2129" w:type="dxa"/>
             <w:tcBorders>
               <w:top w:val="single" w:sz="4" w:space="0" w:color="AAAAAA"/>
               <w:left w:val="single" w:sz="4" w:space="0" w:color="AAAAAA"/>
@@ -1699,9 +1639,6 @@
               <w:pStyle w:val="Normal"/>
               <w:jc w:val="center"/>
               <w:rPr>
-                <w:color w:val="auto"/>
-                <w:sz w:val="20"/>
-                <w:szCs w:val="20"/>
                 <w:lang w:val="es-CR" w:eastAsia="es-ES_tradnl" w:bidi="ar-SA"/>
               </w:rPr>
             </w:pPr>
@@ -1952,21 +1889,130 @@
           <w:color w:val="auto"/>
           <w:lang w:val="es-CR" w:eastAsia="es-ES_tradnl" w:bidi="ar-SA"/>
         </w:rPr>
-        <w:t>(</w:t>
-      </w:r>
-      <w:r>
-        <w:rPr>
-          <w:color w:val="auto"/>
-          <w:lang w:val="es-CR" w:eastAsia="es-ES_tradnl" w:bidi="ar-SA"/>
-        </w:rPr>
-        <w:t>Contenido</w:t>
-      </w:r>
-      <w:r>
-        <w:rPr>
-          <w:color w:val="auto"/>
-          <w:lang w:val="es-CR" w:eastAsia="es-ES_tradnl" w:bidi="ar-SA"/>
-        </w:rPr>
-        <w:t>)</w:t>
+        <w:t>El</w:t>
+      </w:r>
+      <w:r>
+        <w:rPr>
+          <w:color w:val="auto"/>
+          <w:lang w:val="es-CR" w:eastAsia="es-ES_tradnl" w:bidi="ar-SA"/>
+        </w:rPr>
+        <w:t xml:space="preserve"> juego Jumble fue creado por Martin Naydel en 1954 y </w:t>
+      </w:r>
+      <w:r>
+        <w:rPr>
+          <w:color w:val="auto"/>
+          <w:lang w:val="es-CR" w:eastAsia="es-ES_tradnl" w:bidi="ar-SA"/>
+        </w:rPr>
+        <w:t>aparece</w:t>
+      </w:r>
+      <w:r>
+        <w:rPr>
+          <w:color w:val="auto"/>
+          <w:lang w:val="es-CR" w:eastAsia="es-ES_tradnl" w:bidi="ar-SA"/>
+        </w:rPr>
+        <w:t xml:space="preserve"> en periódicos. El juego comprende, por lo general, 4 palabras desordenas con </w:t>
+      </w:r>
+      <w:r>
+        <w:rPr>
+          <w:color w:val="auto"/>
+          <w:lang w:val="es-CR" w:eastAsia="es-ES_tradnl" w:bidi="ar-SA"/>
+        </w:rPr>
+        <w:t>casillas debajo</w:t>
+      </w:r>
+      <w:r>
+        <w:rPr>
+          <w:color w:val="auto"/>
+          <w:lang w:val="es-CR" w:eastAsia="es-ES_tradnl" w:bidi="ar-SA"/>
+        </w:rPr>
+        <w:t xml:space="preserve"> para re-acomodar sus letras, </w:t>
+      </w:r>
+      <w:r>
+        <w:rPr>
+          <w:color w:val="auto"/>
+          <w:lang w:val="es-CR" w:eastAsia="es-ES_tradnl" w:bidi="ar-SA"/>
+        </w:rPr>
+        <w:t>algunas de estas casillas tienen un círculo que indica que esa letra se usará para formar la palabra final. La palabra</w:t>
+      </w:r>
+      <w:r>
+        <w:rPr>
+          <w:color w:val="auto"/>
+          <w:lang w:val="es-CR" w:eastAsia="es-ES_tradnl" w:bidi="ar-SA"/>
+        </w:rPr>
+        <w:t xml:space="preserve"> final </w:t>
+      </w:r>
+      <w:r>
+        <w:rPr>
+          <w:color w:val="auto"/>
+          <w:lang w:val="es-CR" w:eastAsia="es-ES_tradnl" w:bidi="ar-SA"/>
+        </w:rPr>
+        <w:t>se compone de las letras de las casillas con circulo, por eso solo se puede resolver si se resolvieron las otras palabras, y es la más difícil porque suele tener muchas más letras, por eso es que a las palabras las acompaña una pista.</w:t>
+      </w:r>
+      <w:r>
+        <w:rPr>
+          <w:color w:val="auto"/>
+          <w:lang w:val="es-CR" w:eastAsia="es-ES_tradnl" w:bidi="ar-SA"/>
+        </w:rPr>
+        <w:t xml:space="preserve"> </w:t>
+      </w:r>
+      <w:r>
+        <w:rPr>
+          <w:color w:val="auto"/>
+          <w:lang w:val="es-CR" w:eastAsia="es-ES_tradnl" w:bidi="ar-SA"/>
+        </w:rPr>
+        <w:t>A</w:t>
+      </w:r>
+      <w:r>
+        <w:rPr>
+          <w:color w:val="auto"/>
+          <w:lang w:val="es-CR" w:eastAsia="es-ES_tradnl" w:bidi="ar-SA"/>
+        </w:rPr>
+        <w:t xml:space="preserve"> la derecha de las palabras se coloca una ilustración con una leyenda incompleta que </w:t>
+      </w:r>
+      <w:r>
+        <w:rPr>
+          <w:color w:val="auto"/>
+          <w:lang w:val="es-CR" w:eastAsia="es-ES_tradnl" w:bidi="ar-SA"/>
+        </w:rPr>
+        <w:t>sirve de pista ya que la palabra final es la que completa la leyenda.</w:t>
+      </w:r>
+    </w:p>
+    <w:p>
+      <w:pPr>
+        <w:pStyle w:val="Normal"/>
+        <w:spacing w:before="0" w:after="120"/>
+        <w:jc w:val="both"/>
+        <w:rPr>
+          <w:color w:val="auto"/>
+        </w:rPr>
+      </w:pPr>
+      <w:r>
+        <w:rPr>
+          <w:lang w:val="es-CR" w:eastAsia="es-ES_tradnl" w:bidi="ar-SA"/>
+        </w:rPr>
+      </w:r>
+    </w:p>
+    <w:p>
+      <w:pPr>
+        <w:pStyle w:val="Normal"/>
+        <w:spacing w:before="0" w:after="120"/>
+        <w:jc w:val="both"/>
+        <w:rPr>
+          <w:lang w:val="es-CR" w:eastAsia="es-ES_tradnl" w:bidi="ar-SA"/>
+        </w:rPr>
+      </w:pPr>
+      <w:r>
+        <w:rPr>
+          <w:color w:val="auto"/>
+          <w:lang w:val="es-CR" w:eastAsia="es-ES_tradnl" w:bidi="ar-SA"/>
+        </w:rPr>
+        <w:t>L</w:t>
+      </w:r>
+      <w:r>
+        <w:rPr>
+          <w:color w:val="auto"/>
+          <w:lang w:val="es-CR" w:eastAsia="es-ES_tradnl" w:bidi="ar-SA"/>
+        </w:rPr>
+        <w:t>a versión de este proyecto es mucho más simple ya que solo se debe resolver una sola palabra para ganar, pero se le darán solo 3 intentos al jugados para acertar.</w:t>
       </w:r>
     </w:p>
     <w:p>
@@ -1981,6 +2027,9 @@
         <w:rPr>
           <w:lang w:val="es-CR" w:eastAsia="es-ES_tradnl" w:bidi="ar-SA"/>
         </w:rPr>
+      </w:r>
+      <w:r>
+        <w:br w:type="page"/>
       </w:r>
     </w:p>
     <w:p>
@@ -2026,10 +2075,12 @@
         <w:jc w:val="both"/>
         <w:rPr>
           <w:color w:val="auto"/>
-        </w:rPr>
-      </w:pPr>
-      <w:r>
-        <w:rPr>
+          <w:lang w:val="es-CR" w:eastAsia="es-ES_tradnl" w:bidi="ar-SA"/>
+        </w:rPr>
+      </w:pPr>
+      <w:r>
+        <w:rPr>
+          <w:color w:val="auto"/>
           <w:lang w:val="es-CR" w:eastAsia="es-ES_tradnl" w:bidi="ar-SA"/>
         </w:rPr>
       </w:r>
@@ -2727,21 +2778,305 @@
           <w:color w:val="auto"/>
           <w:lang w:val="es-CR" w:eastAsia="es-ES_tradnl" w:bidi="ar-SA"/>
         </w:rPr>
-        <w:t>(</w:t>
-      </w:r>
-      <w:r>
-        <w:rPr>
-          <w:color w:val="auto"/>
-          <w:lang w:val="es-CR" w:eastAsia="es-ES_tradnl" w:bidi="ar-SA"/>
-        </w:rPr>
-        <w:t>Contenido</w:t>
-      </w:r>
-      <w:r>
-        <w:rPr>
-          <w:color w:val="auto"/>
-          <w:lang w:val="es-CR" w:eastAsia="es-ES_tradnl" w:bidi="ar-SA"/>
-        </w:rPr>
-        <w:t>)</w:t>
+        <w:t>Los siguientes son los requerimientos principales que deben de cumplirse en la programación del juego</w:t>
+      </w:r>
+      <w:r>
+        <w:rPr>
+          <w:color w:val="auto"/>
+          <w:lang w:val="es-CR" w:eastAsia="es-ES_tradnl" w:bidi="ar-SA"/>
+        </w:rPr>
+        <w:t>:</w:t>
+      </w:r>
+    </w:p>
+    <w:p>
+      <w:pPr>
+        <w:pStyle w:val="Normal"/>
+        <w:spacing w:before="0" w:after="80"/>
+        <w:rPr>
+          <w:color w:val="auto"/>
+          <w:lang w:val="es-CR" w:eastAsia="es-ES_tradnl" w:bidi="ar-SA"/>
+        </w:rPr>
+      </w:pPr>
+      <w:r>
+        <w:rPr>
+          <w:color w:val="auto"/>
+          <w:lang w:val="es-CR" w:eastAsia="es-ES_tradnl" w:bidi="ar-SA"/>
+        </w:rPr>
+      </w:r>
+    </w:p>
+    <w:p>
+      <w:pPr>
+        <w:pStyle w:val="ListParagraph"/>
+        <w:numPr>
+          <w:ilvl w:val="0"/>
+          <w:numId w:val="1"/>
+        </w:numPr>
+        <w:spacing w:before="0" w:after="60"/>
+        <w:rPr>
+          <w:lang w:val="es-CR" w:eastAsia="es-ES_tradnl" w:bidi="ar-SA"/>
+        </w:rPr>
+      </w:pPr>
+      <w:r>
+        <w:rPr>
+          <w:color w:val="auto"/>
+          <w:lang w:val="es-CR" w:eastAsia="es-ES_tradnl" w:bidi="ar-SA"/>
+        </w:rPr>
+        <w:t>Escoger una palabra al azar de una lista que ya está en el programa.</w:t>
+      </w:r>
+    </w:p>
+    <w:p>
+      <w:pPr>
+        <w:pStyle w:val="ListParagraph"/>
+        <w:numPr>
+          <w:ilvl w:val="0"/>
+          <w:numId w:val="1"/>
+        </w:numPr>
+        <w:spacing w:before="0" w:after="60"/>
+        <w:rPr>
+          <w:lang w:val="es-CR" w:eastAsia="es-ES_tradnl" w:bidi="ar-SA"/>
+        </w:rPr>
+      </w:pPr>
+      <w:r>
+        <w:rPr>
+          <w:color w:val="auto"/>
+          <w:lang w:val="es-CR" w:eastAsia="es-ES_tradnl" w:bidi="ar-SA"/>
+        </w:rPr>
+        <w:t>Mostrarle al jugador cuántas letras tiene la palabra, usando guiones bajos en lugar de las letras.</w:t>
+      </w:r>
+    </w:p>
+    <w:p>
+      <w:pPr>
+        <w:pStyle w:val="ListParagraph"/>
+        <w:numPr>
+          <w:ilvl w:val="0"/>
+          <w:numId w:val="1"/>
+        </w:numPr>
+        <w:spacing w:before="0" w:after="60"/>
+        <w:rPr>
+          <w:lang w:val="es-CR" w:eastAsia="es-ES_tradnl" w:bidi="ar-SA"/>
+        </w:rPr>
+      </w:pPr>
+      <w:r>
+        <w:rPr>
+          <w:color w:val="auto"/>
+          <w:lang w:val="es-CR" w:eastAsia="es-ES_tradnl" w:bidi="ar-SA"/>
+        </w:rPr>
+        <w:t>Pedirle al jugador que ingrese una letra, sin importar si la escribe en mayúscula o minúscula.</w:t>
+      </w:r>
+    </w:p>
+    <w:p>
+      <w:pPr>
+        <w:pStyle w:val="ListParagraph"/>
+        <w:numPr>
+          <w:ilvl w:val="0"/>
+          <w:numId w:val="1"/>
+        </w:numPr>
+        <w:spacing w:before="0" w:after="60"/>
+        <w:rPr>
+          <w:lang w:val="es-CR" w:eastAsia="es-ES_tradnl" w:bidi="ar-SA"/>
+        </w:rPr>
+      </w:pPr>
+      <w:r>
+        <w:rPr>
+          <w:color w:val="auto"/>
+          <w:lang w:val="es-CR" w:eastAsia="es-ES_tradnl" w:bidi="ar-SA"/>
+        </w:rPr>
+        <w:t>Si la letra está en la palabra, mostrarla en todas las posiciones donde aparece.</w:t>
+      </w:r>
+    </w:p>
+    <w:p>
+      <w:pPr>
+        <w:pStyle w:val="ListParagraph"/>
+        <w:numPr>
+          <w:ilvl w:val="0"/>
+          <w:numId w:val="1"/>
+        </w:numPr>
+        <w:spacing w:before="0" w:after="60"/>
+        <w:rPr>
+          <w:lang w:val="es-CR" w:eastAsia="es-ES_tradnl" w:bidi="ar-SA"/>
+        </w:rPr>
+      </w:pPr>
+      <w:r>
+        <w:rPr>
+          <w:color w:val="auto"/>
+          <w:lang w:val="es-CR" w:eastAsia="es-ES_tradnl" w:bidi="ar-SA"/>
+        </w:rPr>
+        <w:t>Si la letra no está, agregarla a la lista de letras ya usadas y dibujar una parte del cuerpo del ahorcado.</w:t>
+      </w:r>
+    </w:p>
+    <w:p>
+      <w:pPr>
+        <w:pStyle w:val="ListParagraph"/>
+        <w:numPr>
+          <w:ilvl w:val="0"/>
+          <w:numId w:val="1"/>
+        </w:numPr>
+        <w:spacing w:before="0" w:after="60"/>
+        <w:rPr>
+          <w:lang w:val="es-CR" w:eastAsia="es-ES_tradnl" w:bidi="ar-SA"/>
+        </w:rPr>
+      </w:pPr>
+      <w:r>
+        <w:rPr>
+          <w:color w:val="auto"/>
+          <w:lang w:val="es-CR" w:eastAsia="es-ES_tradnl" w:bidi="ar-SA"/>
+        </w:rPr>
+        <w:t>El jugador tiene máximo 7 errores antes de perder. Si los agota, se revela la palabra.</w:t>
+      </w:r>
+    </w:p>
+    <w:p>
+      <w:pPr>
+        <w:pStyle w:val="ListParagraph"/>
+        <w:numPr>
+          <w:ilvl w:val="0"/>
+          <w:numId w:val="1"/>
+        </w:numPr>
+        <w:spacing w:before="0" w:after="60"/>
+        <w:rPr>
+          <w:lang w:val="es-CR" w:eastAsia="es-ES_tradnl" w:bidi="ar-SA"/>
+        </w:rPr>
+      </w:pPr>
+      <w:r>
+        <w:rPr>
+          <w:color w:val="auto"/>
+          <w:lang w:val="es-CR" w:eastAsia="es-ES_tradnl" w:bidi="ar-SA"/>
+        </w:rPr>
+        <w:t>Si el jugador adivina todas las letras antes de llegar a 7 errores, gana.</w:t>
+      </w:r>
+    </w:p>
+    <w:p>
+      <w:pPr>
+        <w:pStyle w:val="Heading2"/>
+        <w:rPr>
+          <w:lang w:val="es-CR" w:eastAsia="es-ES_tradnl" w:bidi="ar-SA"/>
+        </w:rPr>
+      </w:pPr>
+      <w:r>
+        <w:rPr>
+          <w:lang w:val="es-CR" w:eastAsia="es-ES_tradnl" w:bidi="ar-SA"/>
+        </w:rPr>
+      </w:r>
+    </w:p>
+    <w:p>
+      <w:pPr>
+        <w:pStyle w:val="Heading2"/>
+        <w:rPr>
+          <w:lang w:val="es-CR" w:eastAsia="es-ES_tradnl" w:bidi="ar-SA"/>
+        </w:rPr>
+      </w:pPr>
+      <w:r>
+        <w:rPr>
+          <w:color w:val="auto"/>
+          <w:lang w:val="es-CR" w:eastAsia="es-ES_tradnl" w:bidi="ar-SA"/>
+        </w:rPr>
+        <w:t>2.</w:t>
+      </w:r>
+      <w:r>
+        <w:rPr>
+          <w:color w:val="auto"/>
+          <w:lang w:val="es-CR" w:eastAsia="es-ES_tradnl" w:bidi="ar-SA"/>
+        </w:rPr>
+        <w:t>3</w:t>
+      </w:r>
+      <w:r>
+        <w:rPr>
+          <w:color w:val="auto"/>
+          <w:lang w:val="es-CR" w:eastAsia="es-ES_tradnl" w:bidi="ar-SA"/>
+        </w:rPr>
+        <w:t>.1 Situaciones en las que se puede complicar</w:t>
+      </w:r>
+    </w:p>
+    <w:p>
+      <w:pPr>
+        <w:pStyle w:val="Normal"/>
+        <w:spacing w:before="0" w:after="120"/>
+        <w:jc w:val="both"/>
+        <w:rPr>
+          <w:lang w:val="es-CR" w:eastAsia="es-ES_tradnl" w:bidi="ar-SA"/>
+        </w:rPr>
+      </w:pPr>
+      <w:r>
+        <w:rPr>
+          <w:color w:val="auto"/>
+          <w:lang w:val="es-CR" w:eastAsia="es-ES_tradnl" w:bidi="ar-SA"/>
+        </w:rPr>
+        <w:t>Más allá de lo básico, había algunas situaciones que era importante pensar desde antes para que el juego no fuera a fallar:</w:t>
+      </w:r>
+    </w:p>
+    <w:p>
+      <w:pPr>
+        <w:pStyle w:val="Normal"/>
+        <w:spacing w:before="0" w:after="80"/>
+        <w:rPr>
+          <w:color w:themeColor="text1" w:val="000000"/>
+          <w:lang w:val="es-CR" w:eastAsia="es-ES_tradnl" w:bidi="ar-SA"/>
+        </w:rPr>
+      </w:pPr>
+      <w:r>
+        <w:rPr>
+          <w:color w:themeColor="text1" w:val="000000"/>
+          <w:lang w:val="es-CR" w:eastAsia="es-ES_tradnl" w:bidi="ar-SA"/>
+        </w:rPr>
+      </w:r>
+    </w:p>
+    <w:p>
+      <w:pPr>
+        <w:pStyle w:val="ListParagraph"/>
+        <w:numPr>
+          <w:ilvl w:val="0"/>
+          <w:numId w:val="2"/>
+        </w:numPr>
+        <w:spacing w:before="0" w:after="60"/>
+        <w:rPr>
+          <w:lang w:val="es-CR" w:eastAsia="es-ES_tradnl" w:bidi="ar-SA"/>
+        </w:rPr>
+      </w:pPr>
+      <w:r>
+        <w:rPr>
+          <w:color w:val="auto"/>
+          <w:lang w:val="es-CR" w:eastAsia="es-ES_tradnl" w:bidi="ar-SA"/>
+        </w:rPr>
+        <w:t>¿Qué pasa si el jugador escribe dos letras juntas, o un número, o un símbolo? Hay que ignorar eso y volver a pedir una letra válida.</w:t>
+      </w:r>
+    </w:p>
+    <w:p>
+      <w:pPr>
+        <w:pStyle w:val="ListParagraph"/>
+        <w:numPr>
+          <w:ilvl w:val="0"/>
+          <w:numId w:val="2"/>
+        </w:numPr>
+        <w:spacing w:before="0" w:after="60"/>
+        <w:rPr>
+          <w:lang w:val="es-CR" w:eastAsia="es-ES_tradnl" w:bidi="ar-SA"/>
+        </w:rPr>
+      </w:pPr>
+      <w:r>
+        <w:rPr>
+          <w:color w:val="auto"/>
+          <w:lang w:val="es-CR" w:eastAsia="es-ES_tradnl" w:bidi="ar-SA"/>
+        </w:rPr>
+        <w:t>¿Qué pasa si repite una letra que ya usó antes? No debe contarse como error, solo hay que avisarle y pedirle que pruebe otra.</w:t>
+      </w:r>
+    </w:p>
+    <w:p>
+      <w:pPr>
+        <w:pStyle w:val="ListParagraph"/>
+        <w:numPr>
+          <w:ilvl w:val="0"/>
+          <w:numId w:val="2"/>
+        </w:numPr>
+        <w:spacing w:before="0" w:after="60"/>
+        <w:rPr>
+          <w:lang w:val="es-CR" w:eastAsia="es-ES_tradnl" w:bidi="ar-SA"/>
+        </w:rPr>
+      </w:pPr>
+      <w:r>
+        <w:rPr>
+          <w:color w:val="auto"/>
+          <w:lang w:val="es-CR" w:eastAsia="es-ES_tradnl" w:bidi="ar-SA"/>
+        </w:rPr>
+        <w:t>¿Qué pasa si adivina la última letra justo en el séptimo intento? Tiene que registrarse como victoria, no como derrota.</w:t>
       </w:r>
     </w:p>
     <w:p>
@@ -2749,13 +3084,16 @@
         <w:pStyle w:val="ListParagraph"/>
         <w:spacing w:before="0" w:after="60"/>
         <w:rPr>
-          <w:lang w:val="es-CR" w:eastAsia="es-ES_tradnl" w:bidi="ar-SA"/>
-        </w:rPr>
-      </w:pPr>
-      <w:r>
-        <w:rPr>
-          <w:lang w:val="es-CR" w:eastAsia="es-ES_tradnl" w:bidi="ar-SA"/>
-        </w:rPr>
+          <w:color w:val="auto"/>
+        </w:rPr>
+      </w:pPr>
+      <w:r>
+        <w:rPr>
+          <w:lang w:val="es-CR" w:eastAsia="es-ES_tradnl" w:bidi="ar-SA"/>
+        </w:rPr>
+      </w:r>
+      <w:r>
+        <w:br w:type="page"/>
       </w:r>
     </w:p>
     <w:p>
@@ -2801,10 +3139,12 @@
         <w:jc w:val="both"/>
         <w:rPr>
           <w:color w:val="auto"/>
-        </w:rPr>
-      </w:pPr>
-      <w:r>
-        <w:rPr>
+          <w:lang w:val="es-CR" w:eastAsia="es-ES_tradnl" w:bidi="ar-SA"/>
+        </w:rPr>
+      </w:pPr>
+      <w:r>
+        <w:rPr>
+          <w:color w:val="auto"/>
           <w:lang w:val="es-CR" w:eastAsia="es-ES_tradnl" w:bidi="ar-SA"/>
         </w:rPr>
       </w:r>
@@ -2984,10 +3324,12 @@
         <w:jc w:val="both"/>
         <w:rPr>
           <w:color w:val="auto"/>
-        </w:rPr>
-      </w:pPr>
-      <w:r>
-        <w:rPr>
+          <w:lang w:val="es-CR" w:eastAsia="es-ES_tradnl" w:bidi="ar-SA"/>
+        </w:rPr>
+      </w:pPr>
+      <w:r>
+        <w:rPr>
+          <w:color w:val="auto"/>
           <w:lang w:val="es-CR" w:eastAsia="es-ES_tradnl" w:bidi="ar-SA"/>
         </w:rPr>
       </w:r>
@@ -2998,34 +3340,19 @@
         <w:spacing w:before="0" w:after="120"/>
         <w:jc w:val="both"/>
         <w:rPr>
+          <w:lang w:val="es-CR" w:eastAsia="es-ES_tradnl" w:bidi="ar-SA"/>
+        </w:rPr>
+      </w:pPr>
+      <w:r>
+        <w:rPr>
           <w:b/>
           <w:bCs/>
+          <w:color w:val="auto"/>
           <w:sz w:val="26"/>
           <w:szCs w:val="26"/>
           <w:lang w:val="es-CR" w:eastAsia="es-ES_tradnl" w:bidi="ar-SA"/>
         </w:rPr>
-      </w:pPr>
-      <w:r>
-        <w:rPr>
-          <w:b/>
-          <w:bCs/>
-          <w:color w:val="auto"/>
-          <w:sz w:val="26"/>
-          <w:szCs w:val="26"/>
-          <w:lang w:val="es-CR" w:eastAsia="es-ES_tradnl" w:bidi="ar-SA"/>
-        </w:rPr>
-        <w:t xml:space="preserve">2.4.1 </w:t>
-      </w:r>
-      <w:r>
-        <w:rPr>
-          <w:b/>
-          <w:bCs/>
-          <w:color w:val="auto"/>
-          <w:sz w:val="26"/>
-          <w:szCs w:val="26"/>
-          <w:lang w:val="es-CR" w:eastAsia="es-ES_tradnl" w:bidi="ar-SA"/>
-        </w:rPr>
-        <w:t>Posibles complicaciones</w:t>
+        <w:t>2.4.1 Posibles complicaciones</w:t>
       </w:r>
     </w:p>
     <w:p>
@@ -3052,10 +3379,12 @@
         <w:jc w:val="both"/>
         <w:rPr>
           <w:color w:val="auto"/>
-        </w:rPr>
-      </w:pPr>
-      <w:r>
-        <w:rPr>
+          <w:lang w:val="es-CR" w:eastAsia="es-ES_tradnl" w:bidi="ar-SA"/>
+        </w:rPr>
+      </w:pPr>
+      <w:r>
+        <w:rPr>
+          <w:color w:val="auto"/>
           <w:lang w:val="es-CR" w:eastAsia="es-ES_tradnl" w:bidi="ar-SA"/>
         </w:rPr>
       </w:r>
@@ -4552,21 +4881,7 @@
           <w:color w:val="auto"/>
           <w:lang w:val="es-CR" w:eastAsia="es-ES_tradnl" w:bidi="ar-SA"/>
         </w:rPr>
-        <w:t>(</w:t>
-      </w:r>
-      <w:r>
-        <w:rPr>
-          <w:color w:val="auto"/>
-          <w:lang w:val="es-CR" w:eastAsia="es-ES_tradnl" w:bidi="ar-SA"/>
-        </w:rPr>
-        <w:t>Contenido</w:t>
-      </w:r>
-      <w:r>
-        <w:rPr>
-          <w:color w:val="auto"/>
-          <w:lang w:val="es-CR" w:eastAsia="es-ES_tradnl" w:bidi="ar-SA"/>
-        </w:rPr>
-        <w:t>)</w:t>
+        <w:t>(Contenido)</w:t>
       </w:r>
     </w:p>
     <w:p>
@@ -4611,12 +4926,13 @@
         <w:spacing w:before="0" w:after="120"/>
         <w:jc w:val="both"/>
         <w:rPr>
-          <w:color w:val="auto"/>
-        </w:rPr>
-      </w:pPr>
-      <w:r>
-        <w:rPr>
-          <w:color w:val="auto"/>
+          <w:lang w:val="es-CR" w:eastAsia="es-ES_tradnl" w:bidi="ar-SA"/>
+        </w:rPr>
+      </w:pPr>
+      <w:r>
+        <w:rPr>
+          <w:color w:val="auto"/>
+          <w:lang w:val="es-CR" w:eastAsia="es-ES_tradnl" w:bidi="ar-SA"/>
         </w:rPr>
         <w:t>Ya definido el juego, se dividió el código en una cantidad remota de funciones para que sea más fácil de revisar en caso de errores. Cada función se responsabiliza de una etapa del juego como la generación del número, el reinicio de este o si el número introducido es correcto.</w:t>
       </w:r>
@@ -4627,11 +4943,13 @@
         <w:spacing w:before="0" w:after="80"/>
         <w:rPr>
           <w:color w:val="auto"/>
-        </w:rPr>
-      </w:pPr>
-      <w:r>
-        <w:rPr>
-          <w:color w:val="auto"/>
+          <w:lang w:val="es-CR" w:eastAsia="es-ES_tradnl" w:bidi="ar-SA"/>
+        </w:rPr>
+      </w:pPr>
+      <w:r>
+        <w:rPr>
+          <w:color w:val="auto"/>
+          <w:lang w:val="es-CR" w:eastAsia="es-ES_tradnl" w:bidi="ar-SA"/>
         </w:rPr>
       </w:r>
     </w:p>
@@ -4639,20 +4957,15 @@
       <w:pPr>
         <w:pStyle w:val="Heading2"/>
         <w:rPr>
-          <w:color w:val="auto"/>
-        </w:rPr>
-      </w:pPr>
-      <w:r>
-        <w:rPr>
-          <w:color w:val="auto"/>
-        </w:rPr>
-        <w:t xml:space="preserve">3.4.1 </w:t>
-      </w:r>
-      <w:r>
-        <w:rPr>
-          <w:color w:val="auto"/>
-        </w:rPr>
-        <w:t>Cómo se organizó el código</w:t>
+          <w:lang w:val="es-CR" w:eastAsia="es-ES_tradnl" w:bidi="ar-SA"/>
+        </w:rPr>
+      </w:pPr>
+      <w:r>
+        <w:rPr>
+          <w:color w:val="auto"/>
+          <w:lang w:val="es-CR" w:eastAsia="es-ES_tradnl" w:bidi="ar-SA"/>
+        </w:rPr>
+        <w:t>3.4.1 Cómo se organizó el código</w:t>
       </w:r>
     </w:p>
     <w:p>
@@ -4664,12 +4977,13 @@
         </w:numPr>
         <w:spacing w:before="0" w:after="60"/>
         <w:rPr>
-          <w:color w:val="auto"/>
-        </w:rPr>
-      </w:pPr>
-      <w:r>
-        <w:rPr>
-          <w:color w:val="auto"/>
+          <w:lang w:val="es-CR" w:eastAsia="es-ES_tradnl" w:bidi="ar-SA"/>
+        </w:rPr>
+      </w:pPr>
+      <w:r>
+        <w:rPr>
+          <w:color w:val="auto"/>
+          <w:lang w:val="es-CR" w:eastAsia="es-ES_tradnl" w:bidi="ar-SA"/>
         </w:rPr>
         <w:t>Menu_juego_adivinar(): Principalmente se encarga de mostrar una pantalla de bienvenida al jugador; en esta pantalla se explica de que consiste el juego y le pregunta al jugador si quiere proceder o volver al menú principal.</w:t>
       </w:r>
@@ -4683,12 +4997,13 @@
         </w:numPr>
         <w:spacing w:before="0" w:after="60"/>
         <w:rPr>
-          <w:color w:val="auto"/>
-        </w:rPr>
-      </w:pPr>
-      <w:r>
-        <w:rPr>
-          <w:color w:val="auto"/>
+          <w:lang w:val="es-CR" w:eastAsia="es-ES_tradnl" w:bidi="ar-SA"/>
+        </w:rPr>
+      </w:pPr>
+      <w:r>
+        <w:rPr>
+          <w:color w:val="auto"/>
+          <w:lang w:val="es-CR" w:eastAsia="es-ES_tradnl" w:bidi="ar-SA"/>
         </w:rPr>
         <w:t>adivinar(): Sus múltiples funciones son medir la cantidad de intentos que cuenta el jugador, se encarga de solicitarle al jugador un número, si el número ingresado es igual al número secreto gana el juego y se le pregunta si desea volver a jugar o salir al menú principal.</w:t>
       </w:r>
@@ -4702,12 +5017,13 @@
         </w:numPr>
         <w:spacing w:before="0" w:after="60"/>
         <w:rPr>
-          <w:color w:val="auto"/>
-        </w:rPr>
-      </w:pPr>
-      <w:r>
-        <w:rPr>
-          <w:color w:val="auto"/>
+          <w:lang w:val="es-CR" w:eastAsia="es-ES_tradnl" w:bidi="ar-SA"/>
+        </w:rPr>
+      </w:pPr>
+      <w:r>
+        <w:rPr>
+          <w:color w:val="auto"/>
+          <w:lang w:val="es-CR" w:eastAsia="es-ES_tradnl" w:bidi="ar-SA"/>
         </w:rPr>
         <w:t>numero_es_incorrecto(): Las tareas de esta función son: Revisar que el número ingresado se menor a cien y mayor a cero, si el número ingresado está fuera de estas restricciones se le avisa al jugador los valores máximos y mínimo de dicho número y no se le resta un intento; Si el número ingresado es válido, pero no es el número secreto, se añade el número a una lista de número erróneos, el programa le avisa al jugador si el número es mayor o menor al número secreto y se le resta un intento.</w:t>
       </w:r>
@@ -4721,12 +5037,13 @@
         </w:numPr>
         <w:spacing w:before="0" w:after="60"/>
         <w:rPr>
-          <w:color w:val="auto"/>
-        </w:rPr>
-      </w:pPr>
-      <w:r>
-        <w:rPr>
-          <w:color w:val="auto"/>
+          <w:lang w:val="es-CR" w:eastAsia="es-ES_tradnl" w:bidi="ar-SA"/>
+        </w:rPr>
+      </w:pPr>
+      <w:r>
+        <w:rPr>
+          <w:color w:val="auto"/>
+          <w:lang w:val="es-CR" w:eastAsia="es-ES_tradnl" w:bidi="ar-SA"/>
         </w:rPr>
         <w:t>sin_intentos(): La única función que tiene es que en caso de que el jugador tengo cero intentos mostrar una pantalla que indica que perdió el juego y preguntar si quiero o volver a jugar o, por su contrario, salir al menú principal.</w:t>
       </w:r>
@@ -4740,12 +5057,13 @@
         </w:numPr>
         <w:spacing w:before="0" w:after="60"/>
         <w:rPr>
-          <w:color w:val="auto"/>
-        </w:rPr>
-      </w:pPr>
-      <w:r>
-        <w:rPr>
-          <w:color w:val="auto"/>
+          <w:lang w:val="es-CR" w:eastAsia="es-ES_tradnl" w:bidi="ar-SA"/>
+        </w:rPr>
+      </w:pPr>
+      <w:r>
+        <w:rPr>
+          <w:color w:val="auto"/>
+          <w:lang w:val="es-CR" w:eastAsia="es-ES_tradnl" w:bidi="ar-SA"/>
         </w:rPr>
         <w:t>reinicio(): Los únicos trabajos de esta función es: volver a generar un número secreto nuevo, borrar la lista de números erróneos y restaura los intentos a seis.</w:t>
       </w:r>
@@ -4759,12 +5077,13 @@
         </w:numPr>
         <w:spacing w:before="0" w:after="60"/>
         <w:rPr>
-          <w:color w:val="auto"/>
-        </w:rPr>
-      </w:pPr>
-      <w:r>
-        <w:rPr>
-          <w:color w:val="auto"/>
+          <w:lang w:val="es-CR" w:eastAsia="es-ES_tradnl" w:bidi="ar-SA"/>
+        </w:rPr>
+      </w:pPr>
+      <w:r>
+        <w:rPr>
+          <w:color w:val="auto"/>
+          <w:lang w:val="es-CR" w:eastAsia="es-ES_tradnl" w:bidi="ar-SA"/>
         </w:rPr>
         <w:t>no_es_un_numero(): Su única función es que si se detecta que se introdujo un valor no numérico entero se le notifica al jugador y le da la opción de volver a intentar.</w:t>
       </w:r>
@@ -4775,11 +5094,13 @@
         <w:spacing w:before="0" w:after="80"/>
         <w:rPr>
           <w:color w:val="auto"/>
-        </w:rPr>
-      </w:pPr>
-      <w:r>
-        <w:rPr>
-          <w:color w:val="auto"/>
+          <w:lang w:val="es-CR" w:eastAsia="es-ES_tradnl" w:bidi="ar-SA"/>
+        </w:rPr>
+      </w:pPr>
+      <w:r>
+        <w:rPr>
+          <w:color w:val="auto"/>
+          <w:lang w:val="es-CR" w:eastAsia="es-ES_tradnl" w:bidi="ar-SA"/>
         </w:rPr>
       </w:r>
     </w:p>
@@ -4787,20 +5108,15 @@
       <w:pPr>
         <w:pStyle w:val="Heading2"/>
         <w:rPr>
-          <w:color w:val="auto"/>
-        </w:rPr>
-      </w:pPr>
-      <w:r>
-        <w:rPr>
-          <w:color w:val="auto"/>
-        </w:rPr>
-        <w:t xml:space="preserve">3.4.2 </w:t>
-      </w:r>
-      <w:r>
-        <w:rPr>
-          <w:color w:val="auto"/>
-        </w:rPr>
-        <w:t>Cómo se genera y guarda el número secreto</w:t>
+          <w:lang w:val="es-CR" w:eastAsia="es-ES_tradnl" w:bidi="ar-SA"/>
+        </w:rPr>
+      </w:pPr>
+      <w:r>
+        <w:rPr>
+          <w:color w:val="auto"/>
+          <w:lang w:val="es-CR" w:eastAsia="es-ES_tradnl" w:bidi="ar-SA"/>
+        </w:rPr>
+        <w:t>3.4.2 Cómo se genera y guarda el número secreto</w:t>
       </w:r>
     </w:p>
     <w:p>
@@ -4809,12 +5125,13 @@
         <w:spacing w:before="0" w:after="120"/>
         <w:jc w:val="both"/>
         <w:rPr>
-          <w:color w:val="auto"/>
-        </w:rPr>
-      </w:pPr>
-      <w:r>
-        <w:rPr>
-          <w:color w:val="auto"/>
+          <w:lang w:val="es-CR" w:eastAsia="es-ES_tradnl" w:bidi="ar-SA"/>
+        </w:rPr>
+      </w:pPr>
+      <w:r>
+        <w:rPr>
+          <w:color w:val="auto"/>
+          <w:lang w:val="es-CR" w:eastAsia="es-ES_tradnl" w:bidi="ar-SA"/>
         </w:rPr>
         <w:t>El número secreto se genera con una sola línea que llama a random.randint(0, 100) una vez por partida.</w:t>
       </w:r>
@@ -4825,11 +5142,13 @@
         <w:spacing w:before="0" w:after="80"/>
         <w:rPr>
           <w:color w:val="auto"/>
-        </w:rPr>
-      </w:pPr>
-      <w:r>
-        <w:rPr>
-          <w:color w:val="auto"/>
+          <w:lang w:val="es-CR" w:eastAsia="es-ES_tradnl" w:bidi="ar-SA"/>
+        </w:rPr>
+      </w:pPr>
+      <w:r>
+        <w:rPr>
+          <w:color w:val="auto"/>
+          <w:lang w:val="es-CR" w:eastAsia="es-ES_tradnl" w:bidi="ar-SA"/>
         </w:rPr>
       </w:r>
     </w:p>
@@ -4840,7 +5159,7 @@
         <w:spacing w:before="0" w:after="40"/>
         <w:ind w:left="720"/>
         <w:rPr>
-          <w:color w:val="auto"/>
+          <w:lang w:val="es-CR" w:eastAsia="es-ES_tradnl" w:bidi="ar-SA"/>
         </w:rPr>
       </w:pPr>
       <w:r>
@@ -4849,6 +5168,7 @@
           <w:color w:val="auto"/>
           <w:sz w:val="20"/>
           <w:szCs w:val="20"/>
+          <w:lang w:val="es-CR" w:eastAsia="es-ES_tradnl" w:bidi="ar-SA"/>
         </w:rPr>
         <w:t>numero_secreto = random.randint(0, 100)</w:t>
       </w:r>
@@ -4859,11 +5179,13 @@
         <w:spacing w:before="0" w:after="80"/>
         <w:rPr>
           <w:color w:val="auto"/>
-        </w:rPr>
-      </w:pPr>
-      <w:r>
-        <w:rPr>
-          <w:color w:val="auto"/>
+          <w:lang w:val="es-CR" w:eastAsia="es-ES_tradnl" w:bidi="ar-SA"/>
+        </w:rPr>
+      </w:pPr>
+      <w:r>
+        <w:rPr>
+          <w:color w:val="auto"/>
+          <w:lang w:val="es-CR" w:eastAsia="es-ES_tradnl" w:bidi="ar-SA"/>
         </w:rPr>
       </w:r>
     </w:p>
@@ -4873,12 +5195,13 @@
         <w:spacing w:before="0" w:after="120"/>
         <w:jc w:val="both"/>
         <w:rPr>
-          <w:color w:val="auto"/>
-        </w:rPr>
-      </w:pPr>
-      <w:r>
-        <w:rPr>
-          <w:color w:val="auto"/>
+          <w:lang w:val="es-CR" w:eastAsia="es-ES_tradnl" w:bidi="ar-SA"/>
+        </w:rPr>
+      </w:pPr>
+      <w:r>
+        <w:rPr>
+          <w:color w:val="auto"/>
+          <w:lang w:val="es-CR" w:eastAsia="es-ES_tradnl" w:bidi="ar-SA"/>
         </w:rPr>
         <w:t>Los números erróneos se guarda en una lista y se le muestra al jugador para que no intente un número erróneo.</w:t>
       </w:r>
@@ -4889,11 +5212,13 @@
         <w:spacing w:before="0" w:after="80"/>
         <w:rPr>
           <w:color w:val="auto"/>
-        </w:rPr>
-      </w:pPr>
-      <w:r>
-        <w:rPr>
-          <w:color w:val="auto"/>
+          <w:lang w:val="es-CR" w:eastAsia="es-ES_tradnl" w:bidi="ar-SA"/>
+        </w:rPr>
+      </w:pPr>
+      <w:r>
+        <w:rPr>
+          <w:color w:val="auto"/>
+          <w:lang w:val="es-CR" w:eastAsia="es-ES_tradnl" w:bidi="ar-SA"/>
         </w:rPr>
       </w:r>
     </w:p>
@@ -4904,7 +5229,7 @@
         <w:spacing w:before="0" w:after="40"/>
         <w:ind w:left="720"/>
         <w:rPr>
-          <w:color w:val="auto"/>
+          <w:lang w:val="es-CR" w:eastAsia="es-ES_tradnl" w:bidi="ar-SA"/>
         </w:rPr>
       </w:pPr>
       <w:r>
@@ -4913,6 +5238,7 @@
           <w:color w:val="auto"/>
           <w:sz w:val="20"/>
           <w:szCs w:val="20"/>
+          <w:lang w:val="es-CR" w:eastAsia="es-ES_tradnl" w:bidi="ar-SA"/>
         </w:rPr>
         <w:t>numeros_erroneos = []</w:t>
       </w:r>
@@ -4924,7 +5250,7 @@
         <w:spacing w:before="0" w:after="40"/>
         <w:ind w:left="720"/>
         <w:rPr>
-          <w:color w:val="auto"/>
+          <w:lang w:val="es-CR" w:eastAsia="es-ES_tradnl" w:bidi="ar-SA"/>
         </w:rPr>
       </w:pPr>
       <w:r>
@@ -4933,6 +5259,7 @@
           <w:color w:val="auto"/>
           <w:sz w:val="20"/>
           <w:szCs w:val="20"/>
+          <w:lang w:val="es-CR" w:eastAsia="es-ES_tradnl" w:bidi="ar-SA"/>
         </w:rPr>
         <w:t>numeros_erroneos.append(numero_ingresado)</w:t>
       </w:r>
@@ -4944,11 +5271,13 @@
         <w:jc w:val="both"/>
         <w:rPr>
           <w:color w:val="auto"/>
-        </w:rPr>
-      </w:pPr>
-      <w:r>
-        <w:rPr>
-          <w:color w:val="auto"/>
+          <w:lang w:val="es-CR" w:eastAsia="es-ES_tradnl" w:bidi="ar-SA"/>
+        </w:rPr>
+      </w:pPr>
+      <w:r>
+        <w:rPr>
+          <w:color w:val="auto"/>
+          <w:lang w:val="es-CR" w:eastAsia="es-ES_tradnl" w:bidi="ar-SA"/>
         </w:rPr>
       </w:r>
     </w:p>
@@ -4959,11 +5288,13 @@
         <w:jc w:val="both"/>
         <w:rPr>
           <w:color w:val="auto"/>
-        </w:rPr>
-      </w:pPr>
-      <w:r>
-        <w:rPr>
-          <w:color w:val="auto"/>
+          <w:lang w:val="es-CR" w:eastAsia="es-ES_tradnl" w:bidi="ar-SA"/>
+        </w:rPr>
+      </w:pPr>
+      <w:r>
+        <w:rPr>
+          <w:color w:val="auto"/>
+          <w:lang w:val="es-CR" w:eastAsia="es-ES_tradnl" w:bidi="ar-SA"/>
         </w:rPr>
       </w:r>
     </w:p>
@@ -4974,11 +5305,13 @@
         <w:jc w:val="both"/>
         <w:rPr>
           <w:color w:val="auto"/>
-        </w:rPr>
-      </w:pPr>
-      <w:r>
-        <w:rPr>
-          <w:color w:val="auto"/>
+          <w:lang w:val="es-CR" w:eastAsia="es-ES_tradnl" w:bidi="ar-SA"/>
+        </w:rPr>
+      </w:pPr>
+      <w:r>
+        <w:rPr>
+          <w:color w:val="auto"/>
+          <w:lang w:val="es-CR" w:eastAsia="es-ES_tradnl" w:bidi="ar-SA"/>
         </w:rPr>
       </w:r>
     </w:p>
@@ -4986,7 +5319,7 @@
       <w:pPr>
         <w:pStyle w:val="Heading1"/>
         <w:rPr>
-          <w:color w:val="auto"/>
+          <w:lang w:val="es-CR" w:eastAsia="es-ES_tradnl" w:bidi="ar-SA"/>
         </w:rPr>
       </w:pPr>
       <w:r>
@@ -4994,30 +5327,22 @@
           <w:color w:val="auto"/>
           <w:sz w:val="26"/>
           <w:szCs w:val="26"/>
-          <w:lang w:val="es-CR"/>
-        </w:rPr>
-        <w:t xml:space="preserve">3.4.3 </w:t>
-      </w:r>
-      <w:r>
-        <w:rPr>
-          <w:color w:val="auto"/>
-          <w:sz w:val="26"/>
-          <w:szCs w:val="26"/>
-          <w:lang w:val="es-CR"/>
-        </w:rPr>
-        <w:t>Cómo nos aseguramos de que se introdujo un numero entero</w:t>
-      </w:r>
-    </w:p>
-    <w:p>
-      <w:pPr>
-        <w:pStyle w:val="Normal"/>
-        <w:rPr>
-          <w:color w:val="auto"/>
-        </w:rPr>
-      </w:pPr>
-      <w:r>
-        <w:rPr>
-          <w:color w:val="auto"/>
+          <w:lang w:val="es-CR" w:eastAsia="es-ES_tradnl" w:bidi="ar-SA"/>
+        </w:rPr>
+        <w:t>3.4.3 Cómo nos aseguramos de que se introdujo un numero entero</w:t>
+      </w:r>
+    </w:p>
+    <w:p>
+      <w:pPr>
+        <w:pStyle w:val="Normal"/>
+        <w:rPr>
+          <w:lang w:val="es-CR" w:eastAsia="es-ES_tradnl" w:bidi="ar-SA"/>
+        </w:rPr>
+      </w:pPr>
+      <w:r>
+        <w:rPr>
+          <w:color w:val="auto"/>
+          <w:lang w:val="es-CR" w:eastAsia="es-ES_tradnl" w:bidi="ar-SA"/>
         </w:rPr>
         <w:t>Primero se crea una función es caso de que el jugador introduzca un valor que no un número entero, está función solo le avisa al jugador del error.</w:t>
       </w:r>
@@ -5029,7 +5354,7 @@
         <w:spacing w:before="0" w:after="40"/>
         <w:ind w:left="720"/>
         <w:rPr>
-          <w:color w:val="auto"/>
+          <w:lang w:val="es-CR" w:eastAsia="es-ES_tradnl" w:bidi="ar-SA"/>
         </w:rPr>
       </w:pPr>
       <w:r>
@@ -5038,6 +5363,7 @@
           <w:color w:val="auto"/>
           <w:sz w:val="20"/>
           <w:szCs w:val="20"/>
+          <w:lang w:val="es-CR" w:eastAsia="es-ES_tradnl" w:bidi="ar-SA"/>
         </w:rPr>
         <w:t>Def no_es_un_numero():</w:t>
       </w:r>
@@ -5049,7 +5375,7 @@
         <w:spacing w:before="0" w:after="40"/>
         <w:ind w:left="720"/>
         <w:rPr>
-          <w:color w:val="auto"/>
+          <w:lang w:val="es-CR" w:eastAsia="es-ES_tradnl" w:bidi="ar-SA"/>
         </w:rPr>
       </w:pPr>
       <w:r>
@@ -5058,6 +5384,7 @@
           <w:color w:val="auto"/>
           <w:sz w:val="20"/>
           <w:szCs w:val="20"/>
+          <w:lang w:val="es-CR" w:eastAsia="es-ES_tradnl" w:bidi="ar-SA"/>
         </w:rPr>
         <w:tab/>
         <w:t>limpiar()</w:t>
@@ -5070,7 +5397,7 @@
         <w:spacing w:before="0" w:after="40"/>
         <w:ind w:left="720"/>
         <w:rPr>
-          <w:color w:val="auto"/>
+          <w:lang w:val="es-CR" w:eastAsia="es-ES_tradnl" w:bidi="ar-SA"/>
         </w:rPr>
       </w:pPr>
       <w:r>
@@ -5079,6 +5406,7 @@
           <w:color w:val="auto"/>
           <w:sz w:val="20"/>
           <w:szCs w:val="20"/>
+          <w:lang w:val="es-CR" w:eastAsia="es-ES_tradnl" w:bidi="ar-SA"/>
         </w:rPr>
         <w:tab/>
         <w:t>print(“ ”)</w:t>
@@ -5091,7 +5419,7 @@
         <w:spacing w:before="0" w:after="40"/>
         <w:ind w:left="720"/>
         <w:rPr>
-          <w:color w:val="auto"/>
+          <w:lang w:val="es-CR" w:eastAsia="es-ES_tradnl" w:bidi="ar-SA"/>
         </w:rPr>
       </w:pPr>
       <w:r>
@@ -5100,6 +5428,7 @@
           <w:color w:val="auto"/>
           <w:sz w:val="20"/>
           <w:szCs w:val="20"/>
+          <w:lang w:val="es-CR" w:eastAsia="es-ES_tradnl" w:bidi="ar-SA"/>
         </w:rPr>
         <w:tab/>
         <w:t>input(“ ”)</w:t>
@@ -5112,7 +5441,7 @@
         <w:spacing w:before="0" w:after="40"/>
         <w:ind w:left="720"/>
         <w:rPr>
-          <w:color w:val="auto"/>
+          <w:lang w:val="es-CR" w:eastAsia="es-ES_tradnl" w:bidi="ar-SA"/>
         </w:rPr>
       </w:pPr>
       <w:r>
@@ -5121,6 +5450,7 @@
           <w:color w:val="auto"/>
           <w:sz w:val="20"/>
           <w:szCs w:val="20"/>
+          <w:lang w:val="es-CR" w:eastAsia="es-ES_tradnl" w:bidi="ar-SA"/>
         </w:rPr>
         <w:tab/>
         <w:t>return adivinar</w:t>
@@ -5133,6 +5463,7 @@
           <w:b/>
           <w:bCs/>
           <w:color w:val="auto"/>
+          <w:lang w:val="es-CR" w:eastAsia="es-ES_tradnl" w:bidi="ar-SA"/>
         </w:rPr>
       </w:pPr>
       <w:r>
@@ -5140,19 +5471,21 @@
           <w:b/>
           <w:bCs/>
           <w:color w:val="auto"/>
-        </w:rPr>
-      </w:r>
-    </w:p>
-    <w:p>
-      <w:pPr>
-        <w:pStyle w:val="Normal"/>
-        <w:rPr>
-          <w:color w:val="auto"/>
-        </w:rPr>
-      </w:pPr>
-      <w:r>
-        <w:rPr>
-          <w:color w:val="auto"/>
+          <w:lang w:val="es-CR" w:eastAsia="es-ES_tradnl" w:bidi="ar-SA"/>
+        </w:rPr>
+      </w:r>
+    </w:p>
+    <w:p>
+      <w:pPr>
+        <w:pStyle w:val="Normal"/>
+        <w:rPr>
+          <w:lang w:val="es-CR" w:eastAsia="es-ES_tradnl" w:bidi="ar-SA"/>
+        </w:rPr>
+      </w:pPr>
+      <w:r>
+        <w:rPr>
+          <w:color w:val="auto"/>
+          <w:lang w:val="es-CR" w:eastAsia="es-ES_tradnl" w:bidi="ar-SA"/>
         </w:rPr>
         <w:t xml:space="preserve">Por otra parte, el string que se encarga de determinar si un valor es un número entero es </w:t>
       </w:r>
@@ -5164,18 +5497,16 @@
         <w:spacing w:before="0" w:after="40"/>
         <w:ind w:left="720"/>
         <w:rPr>
+          <w:lang w:val="es-CR" w:eastAsia="es-ES_tradnl" w:bidi="ar-SA"/>
+        </w:rPr>
+      </w:pPr>
+      <w:r>
+        <w:rPr>
           <w:rFonts w:ascii="Courier New" w:hAnsi="Courier New"/>
           <w:color w:val="auto"/>
           <w:sz w:val="20"/>
           <w:szCs w:val="20"/>
-        </w:rPr>
-      </w:pPr>
-      <w:r>
-        <w:rPr>
-          <w:rFonts w:ascii="Courier New" w:hAnsi="Courier New"/>
-          <w:color w:val="auto"/>
-          <w:sz w:val="20"/>
-          <w:szCs w:val="20"/>
+          <w:lang w:val="es-CR" w:eastAsia="es-ES_tradnl" w:bidi="ar-SA"/>
         </w:rPr>
         <w:t>. isdigit()</w:t>
       </w:r>
@@ -5185,24 +5516,27 @@
         <w:pStyle w:val="Normal"/>
         <w:rPr>
           <w:color w:val="auto"/>
-        </w:rPr>
-      </w:pPr>
-      <w:r>
-        <w:rPr>
-          <w:color w:val="auto"/>
-        </w:rPr>
-      </w:r>
-    </w:p>
-    <w:p>
-      <w:pPr>
-        <w:pStyle w:val="Normal"/>
-        <w:rPr>
-          <w:color w:val="auto"/>
-        </w:rPr>
-      </w:pPr>
-      <w:r>
-        <w:rPr>
-          <w:color w:val="auto"/>
+          <w:lang w:val="es-CR" w:eastAsia="es-ES_tradnl" w:bidi="ar-SA"/>
+        </w:rPr>
+      </w:pPr>
+      <w:r>
+        <w:rPr>
+          <w:color w:val="auto"/>
+          <w:lang w:val="es-CR" w:eastAsia="es-ES_tradnl" w:bidi="ar-SA"/>
+        </w:rPr>
+      </w:r>
+    </w:p>
+    <w:p>
+      <w:pPr>
+        <w:pStyle w:val="Normal"/>
+        <w:rPr>
+          <w:lang w:val="es-CR" w:eastAsia="es-ES_tradnl" w:bidi="ar-SA"/>
+        </w:rPr>
+      </w:pPr>
+      <w:r>
+        <w:rPr>
+          <w:color w:val="auto"/>
+          <w:lang w:val="es-CR" w:eastAsia="es-ES_tradnl" w:bidi="ar-SA"/>
         </w:rPr>
         <w:t>Se utiliza para revisar sin un valor es un número entero, si el valor analizado no es un número entero se emitirá un False como respuesta. En el proyecto se utilizó de esta manera:</w:t>
       </w:r>
@@ -5214,18 +5548,16 @@
         <w:spacing w:before="0" w:after="40"/>
         <w:ind w:left="720"/>
         <w:rPr>
+          <w:lang w:val="es-CR" w:eastAsia="es-ES_tradnl" w:bidi="ar-SA"/>
+        </w:rPr>
+      </w:pPr>
+      <w:r>
+        <w:rPr>
           <w:rFonts w:ascii="Courier New" w:hAnsi="Courier New"/>
           <w:color w:val="auto"/>
           <w:sz w:val="20"/>
           <w:szCs w:val="20"/>
-        </w:rPr>
-      </w:pPr>
-      <w:r>
-        <w:rPr>
-          <w:rFonts w:ascii="Courier New" w:hAnsi="Courier New"/>
-          <w:color w:val="auto"/>
-          <w:sz w:val="20"/>
-          <w:szCs w:val="20"/>
+          <w:lang w:val="es-CR" w:eastAsia="es-ES_tradnl" w:bidi="ar-SA"/>
         </w:rPr>
         <w:t>numero = input(“ “)</w:t>
       </w:r>
@@ -5237,18 +5569,16 @@
         <w:spacing w:before="0" w:after="40"/>
         <w:ind w:left="720"/>
         <w:rPr>
+          <w:lang w:val="es-CR" w:eastAsia="es-ES_tradnl" w:bidi="ar-SA"/>
+        </w:rPr>
+      </w:pPr>
+      <w:r>
+        <w:rPr>
           <w:rFonts w:ascii="Courier New" w:hAnsi="Courier New"/>
           <w:color w:val="auto"/>
           <w:sz w:val="20"/>
           <w:szCs w:val="20"/>
-        </w:rPr>
-      </w:pPr>
-      <w:r>
-        <w:rPr>
-          <w:rFonts w:ascii="Courier New" w:hAnsi="Courier New"/>
-          <w:color w:val="auto"/>
-          <w:sz w:val="20"/>
-          <w:szCs w:val="20"/>
+          <w:lang w:val="es-CR" w:eastAsia="es-ES_tradnl" w:bidi="ar-SA"/>
         </w:rPr>
         <w:t>If numero.isdigit() == False:</w:t>
       </w:r>
@@ -5260,18 +5590,16 @@
         <w:spacing w:before="0" w:after="40"/>
         <w:ind w:left="720"/>
         <w:rPr>
+          <w:lang w:val="es-CR" w:eastAsia="es-ES_tradnl" w:bidi="ar-SA"/>
+        </w:rPr>
+      </w:pPr>
+      <w:r>
+        <w:rPr>
           <w:rFonts w:ascii="Courier New" w:hAnsi="Courier New"/>
           <w:color w:val="auto"/>
           <w:sz w:val="20"/>
           <w:szCs w:val="20"/>
-        </w:rPr>
-      </w:pPr>
-      <w:r>
-        <w:rPr>
-          <w:rFonts w:ascii="Courier New" w:hAnsi="Courier New"/>
-          <w:color w:val="auto"/>
-          <w:sz w:val="20"/>
-          <w:szCs w:val="20"/>
+          <w:lang w:val="es-CR" w:eastAsia="es-ES_tradnl" w:bidi="ar-SA"/>
         </w:rPr>
         <w:tab/>
         <w:t>No_es_un_numero()</w:t>
@@ -5282,24 +5610,27 @@
         <w:pStyle w:val="Normal"/>
         <w:rPr>
           <w:color w:val="auto"/>
-        </w:rPr>
-      </w:pPr>
-      <w:r>
-        <w:rPr>
-          <w:color w:val="auto"/>
-        </w:rPr>
-      </w:r>
-    </w:p>
-    <w:p>
-      <w:pPr>
-        <w:pStyle w:val="Normal"/>
-        <w:rPr>
-          <w:color w:val="auto"/>
-        </w:rPr>
-      </w:pPr>
-      <w:r>
-        <w:rPr>
-          <w:color w:val="auto"/>
+          <w:lang w:val="es-CR" w:eastAsia="es-ES_tradnl" w:bidi="ar-SA"/>
+        </w:rPr>
+      </w:pPr>
+      <w:r>
+        <w:rPr>
+          <w:color w:val="auto"/>
+          <w:lang w:val="es-CR" w:eastAsia="es-ES_tradnl" w:bidi="ar-SA"/>
+        </w:rPr>
+      </w:r>
+    </w:p>
+    <w:p>
+      <w:pPr>
+        <w:pStyle w:val="Normal"/>
+        <w:rPr>
+          <w:lang w:val="es-CR" w:eastAsia="es-ES_tradnl" w:bidi="ar-SA"/>
+        </w:rPr>
+      </w:pPr>
+      <w:r>
+        <w:rPr>
+          <w:color w:val="auto"/>
+          <w:lang w:val="es-CR" w:eastAsia="es-ES_tradnl" w:bidi="ar-SA"/>
         </w:rPr>
         <w:t>En</w:t>
       </w:r>
@@ -5308,12 +5639,14 @@
           <w:b/>
           <w:bCs/>
           <w:color w:val="auto"/>
+          <w:lang w:val="es-CR" w:eastAsia="es-ES_tradnl" w:bidi="ar-SA"/>
         </w:rPr>
         <w:t xml:space="preserve"> </w:t>
       </w:r>
       <w:r>
         <w:rPr>
           <w:color w:val="auto"/>
+          <w:lang w:val="es-CR" w:eastAsia="es-ES_tradnl" w:bidi="ar-SA"/>
         </w:rPr>
         <w:t>cambió si el valor analizado si resultaba ser un número entero se emite un True. En el proyecto se utilizó de esta forma:</w:t>
       </w:r>
@@ -5325,18 +5658,16 @@
         <w:spacing w:before="0" w:after="40"/>
         <w:ind w:left="720"/>
         <w:rPr>
+          <w:lang w:val="es-CR" w:eastAsia="es-ES_tradnl" w:bidi="ar-SA"/>
+        </w:rPr>
+      </w:pPr>
+      <w:r>
+        <w:rPr>
           <w:rFonts w:ascii="Courier New" w:hAnsi="Courier New"/>
           <w:color w:val="auto"/>
           <w:sz w:val="20"/>
           <w:szCs w:val="20"/>
-        </w:rPr>
-      </w:pPr>
-      <w:r>
-        <w:rPr>
-          <w:rFonts w:ascii="Courier New" w:hAnsi="Courier New"/>
-          <w:color w:val="auto"/>
-          <w:sz w:val="20"/>
-          <w:szCs w:val="20"/>
+          <w:lang w:val="es-CR" w:eastAsia="es-ES_tradnl" w:bidi="ar-SA"/>
         </w:rPr>
         <w:t>If numero.isdigit() == True:</w:t>
       </w:r>
@@ -5348,18 +5679,16 @@
         <w:spacing w:before="0" w:after="40"/>
         <w:ind w:left="720"/>
         <w:rPr>
+          <w:lang w:val="es-CR" w:eastAsia="es-ES_tradnl" w:bidi="ar-SA"/>
+        </w:rPr>
+      </w:pPr>
+      <w:r>
+        <w:rPr>
           <w:rFonts w:ascii="Courier New" w:hAnsi="Courier New"/>
           <w:color w:val="auto"/>
           <w:sz w:val="20"/>
           <w:szCs w:val="20"/>
-        </w:rPr>
-      </w:pPr>
-      <w:r>
-        <w:rPr>
-          <w:rFonts w:ascii="Courier New" w:hAnsi="Courier New"/>
-          <w:color w:val="auto"/>
-          <w:sz w:val="20"/>
-          <w:szCs w:val="20"/>
+          <w:lang w:val="es-CR" w:eastAsia="es-ES_tradnl" w:bidi="ar-SA"/>
         </w:rPr>
         <w:tab/>
         <w:t>numero = int(numero)</w:t>
@@ -5369,12 +5698,12 @@
       <w:pPr>
         <w:pStyle w:val="Normal"/>
         <w:rPr>
-          <w:lang w:val="es-CR"/>
-        </w:rPr>
-      </w:pPr>
-      <w:r>
-        <w:rPr>
-          <w:color w:val="auto"/>
+          <w:lang w:val="es-CR" w:eastAsia="es-ES_tradnl" w:bidi="ar-SA"/>
+        </w:rPr>
+      </w:pPr>
+      <w:r>
+        <w:rPr>
+          <w:lang w:val="es-CR" w:eastAsia="es-ES_tradnl" w:bidi="ar-SA"/>
         </w:rPr>
       </w:r>
       <w:r>
@@ -6553,10 +6882,12 @@
         <w:jc w:val="both"/>
         <w:rPr>
           <w:color w:val="auto"/>
-        </w:rPr>
-      </w:pPr>
-      <w:r>
-        <w:rPr>
+          <w:lang w:val="es-CR" w:eastAsia="es-ES_tradnl" w:bidi="ar-SA"/>
+        </w:rPr>
+      </w:pPr>
+      <w:r>
+        <w:rPr>
+          <w:color w:val="auto"/>
           <w:lang w:val="es-CR" w:eastAsia="es-ES_tradnl" w:bidi="ar-SA"/>
         </w:rPr>
       </w:r>
@@ -6576,9 +6907,9 @@
         <w:tblLook w:firstRow="0" w:noVBand="0" w:lastRow="0" w:firstColumn="0" w:lastColumn="0" w:noHBand="0" w:val="0000"/>
       </w:tblPr>
       <w:tblGrid>
-        <w:gridCol w:w="4199"/>
+        <w:gridCol w:w="4198"/>
         <w:gridCol w:w="1800"/>
-        <w:gridCol w:w="3361"/>
+        <w:gridCol w:w="3362"/>
       </w:tblGrid>
       <w:tr>
         <w:trPr>
@@ -6586,7 +6917,7 @@
         </w:trPr>
         <w:tc>
           <w:tcPr>
-            <w:tcW w:w="4199" w:type="dxa"/>
+            <w:tcW w:w="4198" w:type="dxa"/>
             <w:tcBorders>
               <w:top w:val="single" w:sz="4" w:space="0" w:color="AAAAAA"/>
               <w:left w:val="single" w:sz="4" w:space="0" w:color="AAAAAA"/>
@@ -6601,7 +6932,7 @@
               <w:pStyle w:val="Normal"/>
               <w:jc w:val="center"/>
               <w:rPr>
-                <w:color w:themeColor="text1" w:val="000000"/>
+                <w:lang w:val="es-CR" w:eastAsia="es-ES_tradnl" w:bidi="ar-SA"/>
               </w:rPr>
             </w:pPr>
             <w:r>
@@ -6611,6 +6942,7 @@
                 <w:color w:themeColor="text1" w:val="000000"/>
                 <w:sz w:val="20"/>
                 <w:szCs w:val="20"/>
+                <w:lang w:val="es-CR" w:eastAsia="es-ES_tradnl" w:bidi="ar-SA"/>
               </w:rPr>
               <w:t>Requerimiento</w:t>
             </w:r>
@@ -6633,7 +6965,7 @@
               <w:pStyle w:val="Normal"/>
               <w:jc w:val="center"/>
               <w:rPr>
-                <w:color w:themeColor="text1" w:val="000000"/>
+                <w:lang w:val="es-CR" w:eastAsia="es-ES_tradnl" w:bidi="ar-SA"/>
               </w:rPr>
             </w:pPr>
             <w:r>
@@ -6643,6 +6975,7 @@
                 <w:color w:themeColor="text1" w:val="000000"/>
                 <w:sz w:val="20"/>
                 <w:szCs w:val="20"/>
+                <w:lang w:val="es-CR" w:eastAsia="es-ES_tradnl" w:bidi="ar-SA"/>
               </w:rPr>
               <w:t>Estado</w:t>
             </w:r>
@@ -6650,7 +6983,7 @@
         </w:tc>
         <w:tc>
           <w:tcPr>
-            <w:tcW w:w="3361" w:type="dxa"/>
+            <w:tcW w:w="3362" w:type="dxa"/>
             <w:tcBorders>
               <w:top w:val="single" w:sz="4" w:space="0" w:color="AAAAAA"/>
               <w:left w:val="single" w:sz="4" w:space="0" w:color="AAAAAA"/>
@@ -6665,7 +6998,7 @@
               <w:pStyle w:val="Normal"/>
               <w:jc w:val="center"/>
               <w:rPr>
-                <w:color w:themeColor="text1" w:val="000000"/>
+                <w:lang w:val="es-CR" w:eastAsia="es-ES_tradnl" w:bidi="ar-SA"/>
               </w:rPr>
             </w:pPr>
             <w:r>
@@ -6675,6 +7008,7 @@
                 <w:color w:themeColor="text1" w:val="000000"/>
                 <w:sz w:val="20"/>
                 <w:szCs w:val="20"/>
+                <w:lang w:val="es-CR" w:eastAsia="es-ES_tradnl" w:bidi="ar-SA"/>
               </w:rPr>
               <w:t>Observaciones</w:t>
             </w:r>
@@ -6685,7 +7019,7 @@
         <w:trPr/>
         <w:tc>
           <w:tcPr>
-            <w:tcW w:w="4199" w:type="dxa"/>
+            <w:tcW w:w="4198" w:type="dxa"/>
             <w:tcBorders>
               <w:top w:val="single" w:sz="4" w:space="0" w:color="AAAAAA"/>
               <w:left w:val="single" w:sz="4" w:space="0" w:color="AAAAAA"/>
@@ -6698,7 +7032,7 @@
             <w:pPr>
               <w:pStyle w:val="Normal"/>
               <w:rPr>
-                <w:color w:themeColor="text1" w:val="000000"/>
+                <w:lang w:val="es-CR" w:eastAsia="es-ES_tradnl" w:bidi="ar-SA"/>
               </w:rPr>
             </w:pPr>
             <w:r>
@@ -6706,6 +7040,7 @@
                 <w:color w:themeColor="text1" w:val="000000"/>
                 <w:sz w:val="20"/>
                 <w:szCs w:val="20"/>
+                <w:lang w:val="es-CR" w:eastAsia="es-ES_tradnl" w:bidi="ar-SA"/>
               </w:rPr>
               <w:t>Generación de código de 4 dígitos (0-9)</w:t>
             </w:r>
@@ -6726,7 +7061,7 @@
             <w:pPr>
               <w:pStyle w:val="Normal"/>
               <w:rPr>
-                <w:color w:themeColor="text1" w:val="000000"/>
+                <w:lang w:val="es-CR" w:eastAsia="es-ES_tradnl" w:bidi="ar-SA"/>
               </w:rPr>
             </w:pPr>
             <w:r>
@@ -6734,6 +7069,7 @@
                 <w:color w:themeColor="text1" w:val="000000"/>
                 <w:sz w:val="20"/>
                 <w:szCs w:val="20"/>
+                <w:lang w:val="es-CR" w:eastAsia="es-ES_tradnl" w:bidi="ar-SA"/>
               </w:rPr>
               <w:t>Completo</w:t>
             </w:r>
@@ -6741,7 +7077,7 @@
         </w:tc>
         <w:tc>
           <w:tcPr>
-            <w:tcW w:w="3361" w:type="dxa"/>
+            <w:tcW w:w="3362" w:type="dxa"/>
             <w:tcBorders>
               <w:top w:val="single" w:sz="4" w:space="0" w:color="AAAAAA"/>
               <w:left w:val="single" w:sz="4" w:space="0" w:color="AAAAAA"/>
@@ -6754,7 +7090,7 @@
             <w:pPr>
               <w:pStyle w:val="Normal"/>
               <w:rPr>
-                <w:color w:themeColor="text1" w:val="000000"/>
+                <w:lang w:val="es-CR" w:eastAsia="es-ES_tradnl" w:bidi="ar-SA"/>
               </w:rPr>
             </w:pPr>
             <w:r>
@@ -6762,6 +7098,7 @@
                 <w:color w:themeColor="text1" w:val="000000"/>
                 <w:sz w:val="20"/>
                 <w:szCs w:val="20"/>
+                <w:lang w:val="es-CR" w:eastAsia="es-ES_tradnl" w:bidi="ar-SA"/>
               </w:rPr>
               <w:t>Se usa random.randint(0,9) en un list comprehension.</w:t>
             </w:r>
@@ -6772,7 +7109,7 @@
         <w:trPr/>
         <w:tc>
           <w:tcPr>
-            <w:tcW w:w="4199" w:type="dxa"/>
+            <w:tcW w:w="4198" w:type="dxa"/>
             <w:tcBorders>
               <w:top w:val="single" w:sz="4" w:space="0" w:color="AAAAAA"/>
               <w:left w:val="single" w:sz="4" w:space="0" w:color="AAAAAA"/>
@@ -6785,7 +7122,7 @@
             <w:pPr>
               <w:pStyle w:val="Normal"/>
               <w:rPr>
-                <w:color w:themeColor="text1" w:val="000000"/>
+                <w:lang w:val="es-CR" w:eastAsia="es-ES_tradnl" w:bidi="ar-SA"/>
               </w:rPr>
             </w:pPr>
             <w:r>
@@ -6793,6 +7130,7 @@
                 <w:color w:themeColor="text1" w:val="000000"/>
                 <w:sz w:val="20"/>
                 <w:szCs w:val="20"/>
+                <w:lang w:val="es-CR" w:eastAsia="es-ES_tradnl" w:bidi="ar-SA"/>
               </w:rPr>
               <w:t>Mostrar 4 guiones bajos al inicio</w:t>
             </w:r>
@@ -6813,7 +7151,7 @@
             <w:pPr>
               <w:pStyle w:val="Normal"/>
               <w:rPr>
-                <w:color w:themeColor="text1" w:val="000000"/>
+                <w:lang w:val="es-CR" w:eastAsia="es-ES_tradnl" w:bidi="ar-SA"/>
               </w:rPr>
             </w:pPr>
             <w:r>
@@ -6821,6 +7159,7 @@
                 <w:color w:themeColor="text1" w:val="000000"/>
                 <w:sz w:val="20"/>
                 <w:szCs w:val="20"/>
+                <w:lang w:val="es-CR" w:eastAsia="es-ES_tradnl" w:bidi="ar-SA"/>
               </w:rPr>
               <w:t>Completo</w:t>
             </w:r>
@@ -6828,7 +7167,7 @@
         </w:tc>
         <w:tc>
           <w:tcPr>
-            <w:tcW w:w="3361" w:type="dxa"/>
+            <w:tcW w:w="3362" w:type="dxa"/>
             <w:tcBorders>
               <w:top w:val="single" w:sz="4" w:space="0" w:color="AAAAAA"/>
               <w:left w:val="single" w:sz="4" w:space="0" w:color="AAAAAA"/>
@@ -6841,7 +7180,7 @@
             <w:pPr>
               <w:pStyle w:val="Normal"/>
               <w:rPr>
-                <w:color w:themeColor="text1" w:val="000000"/>
+                <w:lang w:val="es-CR" w:eastAsia="es-ES_tradnl" w:bidi="ar-SA"/>
               </w:rPr>
             </w:pPr>
             <w:r>
@@ -6849,6 +7188,7 @@
                 <w:color w:themeColor="text1" w:val="000000"/>
                 <w:sz w:val="20"/>
                 <w:szCs w:val="20"/>
+                <w:lang w:val="es-CR" w:eastAsia="es-ES_tradnl" w:bidi="ar-SA"/>
               </w:rPr>
               <w:t>Se crea la lista progreso = ['_'] * LONGITUD_CODIGO.</w:t>
             </w:r>
@@ -6859,7 +7199,7 @@
         <w:trPr/>
         <w:tc>
           <w:tcPr>
-            <w:tcW w:w="4199" w:type="dxa"/>
+            <w:tcW w:w="4198" w:type="dxa"/>
             <w:tcBorders>
               <w:top w:val="single" w:sz="4" w:space="0" w:color="AAAAAA"/>
               <w:left w:val="single" w:sz="4" w:space="0" w:color="AAAAAA"/>
@@ -6872,7 +7212,7 @@
             <w:pPr>
               <w:pStyle w:val="Normal"/>
               <w:rPr>
-                <w:color w:themeColor="text1" w:val="000000"/>
+                <w:lang w:val="es-CR" w:eastAsia="es-ES_tradnl" w:bidi="ar-SA"/>
               </w:rPr>
             </w:pPr>
             <w:r>
@@ -6880,6 +7220,7 @@
                 <w:color w:themeColor="text1" w:val="000000"/>
                 <w:sz w:val="20"/>
                 <w:szCs w:val="20"/>
+                <w:lang w:val="es-CR" w:eastAsia="es-ES_tradnl" w:bidi="ar-SA"/>
               </w:rPr>
               <w:t>Validación del código ingresado</w:t>
             </w:r>
@@ -6900,7 +7241,7 @@
             <w:pPr>
               <w:pStyle w:val="Normal"/>
               <w:rPr>
-                <w:color w:themeColor="text1" w:val="000000"/>
+                <w:lang w:val="es-CR" w:eastAsia="es-ES_tradnl" w:bidi="ar-SA"/>
               </w:rPr>
             </w:pPr>
             <w:r>
@@ -6908,6 +7249,7 @@
                 <w:color w:themeColor="text1" w:val="000000"/>
                 <w:sz w:val="20"/>
                 <w:szCs w:val="20"/>
+                <w:lang w:val="es-CR" w:eastAsia="es-ES_tradnl" w:bidi="ar-SA"/>
               </w:rPr>
               <w:t>Completo</w:t>
             </w:r>
@@ -6915,7 +7257,7 @@
         </w:tc>
         <w:tc>
           <w:tcPr>
-            <w:tcW w:w="3361" w:type="dxa"/>
+            <w:tcW w:w="3362" w:type="dxa"/>
             <w:tcBorders>
               <w:top w:val="single" w:sz="4" w:space="0" w:color="AAAAAA"/>
               <w:left w:val="single" w:sz="4" w:space="0" w:color="AAAAAA"/>
@@ -6928,7 +7270,7 @@
             <w:pPr>
               <w:pStyle w:val="Normal"/>
               <w:rPr>
-                <w:color w:themeColor="text1" w:val="000000"/>
+                <w:lang w:val="es-CR" w:eastAsia="es-ES_tradnl" w:bidi="ar-SA"/>
               </w:rPr>
             </w:pPr>
             <w:r>
@@ -6936,6 +7278,7 @@
                 <w:color w:themeColor="text1" w:val="000000"/>
                 <w:sz w:val="20"/>
                 <w:szCs w:val="20"/>
+                <w:lang w:val="es-CR" w:eastAsia="es-ES_tradnl" w:bidi="ar-SA"/>
               </w:rPr>
               <w:t>La función obtener_codigo_usuario verifica longitud y que sean dígitos.</w:t>
             </w:r>
@@ -6946,7 +7289,7 @@
         <w:trPr/>
         <w:tc>
           <w:tcPr>
-            <w:tcW w:w="4199" w:type="dxa"/>
+            <w:tcW w:w="4198" w:type="dxa"/>
             <w:tcBorders>
               <w:top w:val="single" w:sz="4" w:space="0" w:color="AAAAAA"/>
               <w:left w:val="single" w:sz="4" w:space="0" w:color="AAAAAA"/>
@@ -6959,7 +7302,7 @@
             <w:pPr>
               <w:pStyle w:val="Normal"/>
               <w:rPr>
-                <w:color w:themeColor="text1" w:val="000000"/>
+                <w:lang w:val="es-CR" w:eastAsia="es-ES_tradnl" w:bidi="ar-SA"/>
               </w:rPr>
             </w:pPr>
             <w:r>
@@ -6967,6 +7310,7 @@
                 <w:color w:themeColor="text1" w:val="000000"/>
                 <w:sz w:val="20"/>
                 <w:szCs w:val="20"/>
+                <w:lang w:val="es-CR" w:eastAsia="es-ES_tradnl" w:bidi="ar-SA"/>
               </w:rPr>
               <w:t>Revelar dígitos correctos en su posición</w:t>
             </w:r>
@@ -6987,7 +7331,7 @@
             <w:pPr>
               <w:pStyle w:val="Normal"/>
               <w:rPr>
-                <w:color w:themeColor="text1" w:val="000000"/>
+                <w:lang w:val="es-CR" w:eastAsia="es-ES_tradnl" w:bidi="ar-SA"/>
               </w:rPr>
             </w:pPr>
             <w:r>
@@ -6995,6 +7339,7 @@
                 <w:color w:themeColor="text1" w:val="000000"/>
                 <w:sz w:val="20"/>
                 <w:szCs w:val="20"/>
+                <w:lang w:val="es-CR" w:eastAsia="es-ES_tradnl" w:bidi="ar-SA"/>
               </w:rPr>
               <w:t>Completo</w:t>
             </w:r>
@@ -7002,7 +7347,7 @@
         </w:tc>
         <w:tc>
           <w:tcPr>
-            <w:tcW w:w="3361" w:type="dxa"/>
+            <w:tcW w:w="3362" w:type="dxa"/>
             <w:tcBorders>
               <w:top w:val="single" w:sz="4" w:space="0" w:color="AAAAAA"/>
               <w:left w:val="single" w:sz="4" w:space="0" w:color="AAAAAA"/>
@@ -7015,7 +7360,7 @@
             <w:pPr>
               <w:pStyle w:val="Normal"/>
               <w:rPr>
-                <w:color w:themeColor="text1" w:val="000000"/>
+                <w:lang w:val="es-CR" w:eastAsia="es-ES_tradnl" w:bidi="ar-SA"/>
               </w:rPr>
             </w:pPr>
             <w:r>
@@ -7023,6 +7368,7 @@
                 <w:color w:themeColor="text1" w:val="000000"/>
                 <w:sz w:val="20"/>
                 <w:szCs w:val="20"/>
+                <w:lang w:val="es-CR" w:eastAsia="es-ES_tradnl" w:bidi="ar-SA"/>
               </w:rPr>
               <w:t>evaluar_codigo() compara posición por posición y retorna el resultado.</w:t>
             </w:r>
@@ -7033,7 +7379,7 @@
         <w:trPr/>
         <w:tc>
           <w:tcPr>
-            <w:tcW w:w="4199" w:type="dxa"/>
+            <w:tcW w:w="4198" w:type="dxa"/>
             <w:tcBorders>
               <w:top w:val="single" w:sz="4" w:space="0" w:color="AAAAAA"/>
               <w:left w:val="single" w:sz="4" w:space="0" w:color="AAAAAA"/>
@@ -7046,7 +7392,7 @@
             <w:pPr>
               <w:pStyle w:val="Normal"/>
               <w:rPr>
-                <w:color w:themeColor="text1" w:val="000000"/>
+                <w:lang w:val="es-CR" w:eastAsia="es-ES_tradnl" w:bidi="ar-SA"/>
               </w:rPr>
             </w:pPr>
             <w:r>
@@ -7054,6 +7400,7 @@
                 <w:color w:themeColor="text1" w:val="000000"/>
                 <w:sz w:val="20"/>
                 <w:szCs w:val="20"/>
+                <w:lang w:val="es-CR" w:eastAsia="es-ES_tradnl" w:bidi="ar-SA"/>
               </w:rPr>
               <w:t>Acumular aciertos entre intentos</w:t>
             </w:r>
@@ -7074,7 +7421,7 @@
             <w:pPr>
               <w:pStyle w:val="Normal"/>
               <w:rPr>
-                <w:color w:themeColor="text1" w:val="000000"/>
+                <w:lang w:val="es-CR" w:eastAsia="es-ES_tradnl" w:bidi="ar-SA"/>
               </w:rPr>
             </w:pPr>
             <w:r>
@@ -7082,6 +7429,7 @@
                 <w:color w:themeColor="text1" w:val="000000"/>
                 <w:sz w:val="20"/>
                 <w:szCs w:val="20"/>
+                <w:lang w:val="es-CR" w:eastAsia="es-ES_tradnl" w:bidi="ar-SA"/>
               </w:rPr>
               <w:t>Completo</w:t>
             </w:r>
@@ -7089,7 +7437,7 @@
         </w:tc>
         <w:tc>
           <w:tcPr>
-            <w:tcW w:w="3361" w:type="dxa"/>
+            <w:tcW w:w="3362" w:type="dxa"/>
             <w:tcBorders>
               <w:top w:val="single" w:sz="4" w:space="0" w:color="AAAAAA"/>
               <w:left w:val="single" w:sz="4" w:space="0" w:color="AAAAAA"/>
@@ -7102,7 +7450,7 @@
             <w:pPr>
               <w:pStyle w:val="Normal"/>
               <w:rPr>
-                <w:color w:themeColor="text1" w:val="000000"/>
+                <w:lang w:val="es-CR" w:eastAsia="es-ES_tradnl" w:bidi="ar-SA"/>
               </w:rPr>
             </w:pPr>
             <w:r>
@@ -7110,6 +7458,7 @@
                 <w:color w:themeColor="text1" w:val="000000"/>
                 <w:sz w:val="20"/>
                 <w:szCs w:val="20"/>
+                <w:lang w:val="es-CR" w:eastAsia="es-ES_tradnl" w:bidi="ar-SA"/>
               </w:rPr>
               <w:t>El progreso se actualiza con cada intento, manteniendo los aciertos anteriores.</w:t>
             </w:r>
@@ -7120,7 +7469,7 @@
         <w:trPr/>
         <w:tc>
           <w:tcPr>
-            <w:tcW w:w="4199" w:type="dxa"/>
+            <w:tcW w:w="4198" w:type="dxa"/>
             <w:tcBorders>
               <w:top w:val="single" w:sz="4" w:space="0" w:color="AAAAAA"/>
               <w:left w:val="single" w:sz="4" w:space="0" w:color="AAAAAA"/>
@@ -7133,7 +7482,7 @@
             <w:pPr>
               <w:pStyle w:val="Normal"/>
               <w:rPr>
-                <w:color w:themeColor="text1" w:val="000000"/>
+                <w:lang w:val="es-CR" w:eastAsia="es-ES_tradnl" w:bidi="ar-SA"/>
               </w:rPr>
             </w:pPr>
             <w:r>
@@ -7141,6 +7490,7 @@
                 <w:color w:themeColor="text1" w:val="000000"/>
                 <w:sz w:val="20"/>
                 <w:szCs w:val="20"/>
+                <w:lang w:val="es-CR" w:eastAsia="es-ES_tradnl" w:bidi="ar-SA"/>
               </w:rPr>
               <w:t>Máximo 7 intentos antes de perder</w:t>
             </w:r>
@@ -7161,7 +7511,7 @@
             <w:pPr>
               <w:pStyle w:val="Normal"/>
               <w:rPr>
-                <w:color w:themeColor="text1" w:val="000000"/>
+                <w:lang w:val="es-CR" w:eastAsia="es-ES_tradnl" w:bidi="ar-SA"/>
               </w:rPr>
             </w:pPr>
             <w:r>
@@ -7169,6 +7519,7 @@
                 <w:color w:themeColor="text1" w:val="000000"/>
                 <w:sz w:val="20"/>
                 <w:szCs w:val="20"/>
+                <w:lang w:val="es-CR" w:eastAsia="es-ES_tradnl" w:bidi="ar-SA"/>
               </w:rPr>
               <w:t>Completo</w:t>
             </w:r>
@@ -7176,7 +7527,7 @@
         </w:tc>
         <w:tc>
           <w:tcPr>
-            <w:tcW w:w="3361" w:type="dxa"/>
+            <w:tcW w:w="3362" w:type="dxa"/>
             <w:tcBorders>
               <w:top w:val="single" w:sz="4" w:space="0" w:color="AAAAAA"/>
               <w:left w:val="single" w:sz="4" w:space="0" w:color="AAAAAA"/>
@@ -7189,7 +7540,7 @@
             <w:pPr>
               <w:pStyle w:val="Normal"/>
               <w:rPr>
-                <w:color w:themeColor="text1" w:val="000000"/>
+                <w:lang w:val="es-CR" w:eastAsia="es-ES_tradnl" w:bidi="ar-SA"/>
               </w:rPr>
             </w:pPr>
             <w:r>
@@ -7197,6 +7548,7 @@
                 <w:color w:themeColor="text1" w:val="000000"/>
                 <w:sz w:val="20"/>
                 <w:szCs w:val="20"/>
+                <w:lang w:val="es-CR" w:eastAsia="es-ES_tradnl" w:bidi="ar-SA"/>
               </w:rPr>
               <w:t>Controlado por la constante MAX_INTENTOS_CODIGO = 7.</w:t>
             </w:r>
@@ -7207,7 +7559,7 @@
         <w:trPr/>
         <w:tc>
           <w:tcPr>
-            <w:tcW w:w="4199" w:type="dxa"/>
+            <w:tcW w:w="4198" w:type="dxa"/>
             <w:tcBorders>
               <w:top w:val="single" w:sz="4" w:space="0" w:color="AAAAAA"/>
               <w:left w:val="single" w:sz="4" w:space="0" w:color="AAAAAA"/>
@@ -7220,7 +7572,7 @@
             <w:pPr>
               <w:pStyle w:val="Normal"/>
               <w:rPr>
-                <w:color w:themeColor="text1" w:val="000000"/>
+                <w:lang w:val="es-CR" w:eastAsia="es-ES_tradnl" w:bidi="ar-SA"/>
               </w:rPr>
             </w:pPr>
             <w:r>
@@ -7228,6 +7580,7 @@
                 <w:color w:themeColor="text1" w:val="000000"/>
                 <w:sz w:val="20"/>
                 <w:szCs w:val="20"/>
+                <w:lang w:val="es-CR" w:eastAsia="es-ES_tradnl" w:bidi="ar-SA"/>
               </w:rPr>
               <w:t>Revelar el código al perder</w:t>
             </w:r>
@@ -7248,7 +7601,7 @@
             <w:pPr>
               <w:pStyle w:val="Normal"/>
               <w:rPr>
-                <w:color w:themeColor="text1" w:val="000000"/>
+                <w:lang w:val="es-CR" w:eastAsia="es-ES_tradnl" w:bidi="ar-SA"/>
               </w:rPr>
             </w:pPr>
             <w:r>
@@ -7256,6 +7609,7 @@
                 <w:color w:themeColor="text1" w:val="000000"/>
                 <w:sz w:val="20"/>
                 <w:szCs w:val="20"/>
+                <w:lang w:val="es-CR" w:eastAsia="es-ES_tradnl" w:bidi="ar-SA"/>
               </w:rPr>
               <w:t>Completo</w:t>
             </w:r>
@@ -7263,7 +7617,7 @@
         </w:tc>
         <w:tc>
           <w:tcPr>
-            <w:tcW w:w="3361" w:type="dxa"/>
+            <w:tcW w:w="3362" w:type="dxa"/>
             <w:tcBorders>
               <w:top w:val="single" w:sz="4" w:space="0" w:color="AAAAAA"/>
               <w:left w:val="single" w:sz="4" w:space="0" w:color="AAAAAA"/>
@@ -7276,7 +7630,7 @@
             <w:pPr>
               <w:pStyle w:val="Normal"/>
               <w:rPr>
-                <w:color w:themeColor="text1" w:val="000000"/>
+                <w:lang w:val="es-CR" w:eastAsia="es-ES_tradnl" w:bidi="ar-SA"/>
               </w:rPr>
             </w:pPr>
             <w:r>
@@ -7284,6 +7638,7 @@
                 <w:color w:themeColor="text1" w:val="000000"/>
                 <w:sz w:val="20"/>
                 <w:szCs w:val="20"/>
+                <w:lang w:val="es-CR" w:eastAsia="es-ES_tradnl" w:bidi="ar-SA"/>
               </w:rPr>
               <w:t>Se imprime codigo_secreto al terminar el bucle sin victoria.</w:t>
             </w:r>
@@ -7294,7 +7649,7 @@
         <w:trPr/>
         <w:tc>
           <w:tcPr>
-            <w:tcW w:w="4199" w:type="dxa"/>
+            <w:tcW w:w="4198" w:type="dxa"/>
             <w:tcBorders>
               <w:top w:val="single" w:sz="4" w:space="0" w:color="AAAAAA"/>
               <w:left w:val="single" w:sz="4" w:space="0" w:color="AAAAAA"/>
@@ -7307,7 +7662,7 @@
             <w:pPr>
               <w:pStyle w:val="Normal"/>
               <w:rPr>
-                <w:color w:themeColor="text1" w:val="000000"/>
+                <w:lang w:val="es-CR" w:eastAsia="es-ES_tradnl" w:bidi="ar-SA"/>
               </w:rPr>
             </w:pPr>
             <w:r>
@@ -7315,6 +7670,7 @@
                 <w:color w:themeColor="text1" w:val="000000"/>
                 <w:sz w:val="20"/>
                 <w:szCs w:val="20"/>
+                <w:lang w:val="es-CR" w:eastAsia="es-ES_tradnl" w:bidi="ar-SA"/>
               </w:rPr>
               <w:t>Documentación con docString</w:t>
             </w:r>
@@ -7335,7 +7691,7 @@
             <w:pPr>
               <w:pStyle w:val="Normal"/>
               <w:rPr>
-                <w:color w:themeColor="text1" w:val="000000"/>
+                <w:lang w:val="es-CR" w:eastAsia="es-ES_tradnl" w:bidi="ar-SA"/>
               </w:rPr>
             </w:pPr>
             <w:r>
@@ -7343,6 +7699,7 @@
                 <w:color w:themeColor="text1" w:val="000000"/>
                 <w:sz w:val="20"/>
                 <w:szCs w:val="20"/>
+                <w:lang w:val="es-CR" w:eastAsia="es-ES_tradnl" w:bidi="ar-SA"/>
               </w:rPr>
               <w:t>Completo</w:t>
             </w:r>
@@ -7350,7 +7707,7 @@
         </w:tc>
         <w:tc>
           <w:tcPr>
-            <w:tcW w:w="3361" w:type="dxa"/>
+            <w:tcW w:w="3362" w:type="dxa"/>
             <w:tcBorders>
               <w:top w:val="single" w:sz="4" w:space="0" w:color="AAAAAA"/>
               <w:left w:val="single" w:sz="4" w:space="0" w:color="AAAAAA"/>
@@ -7363,7 +7720,7 @@
             <w:pPr>
               <w:pStyle w:val="Normal"/>
               <w:rPr>
-                <w:color w:themeColor="text1" w:val="000000"/>
+                <w:lang w:val="es-CR" w:eastAsia="es-ES_tradnl" w:bidi="ar-SA"/>
               </w:rPr>
             </w:pPr>
             <w:r>
@@ -7371,6 +7728,7 @@
                 <w:color w:themeColor="text1" w:val="000000"/>
                 <w:sz w:val="20"/>
                 <w:szCs w:val="20"/>
+                <w:lang w:val="es-CR" w:eastAsia="es-ES_tradnl" w:bidi="ar-SA"/>
               </w:rPr>
               <w:t>Todas las funciones tienen docString con descripción, Args y Returns.</w:t>
             </w:r>
@@ -7385,10 +7743,12 @@
         <w:jc w:val="both"/>
         <w:rPr>
           <w:color w:val="auto"/>
-        </w:rPr>
-      </w:pPr>
-      <w:r>
-        <w:rPr>
+          <w:lang w:val="es-CR" w:eastAsia="es-ES_tradnl" w:bidi="ar-SA"/>
+        </w:rPr>
+      </w:pPr>
+      <w:r>
+        <w:rPr>
+          <w:color w:val="auto"/>
           <w:lang w:val="es-CR" w:eastAsia="es-ES_tradnl" w:bidi="ar-SA"/>
         </w:rPr>
       </w:r>
@@ -7457,21 +7817,7 @@
           <w:color w:val="auto"/>
           <w:lang w:val="es-CR" w:eastAsia="es-ES_tradnl" w:bidi="ar-SA"/>
         </w:rPr>
-        <w:t>(</w:t>
-      </w:r>
-      <w:r>
-        <w:rPr>
-          <w:color w:val="auto"/>
-          <w:lang w:val="es-CR" w:eastAsia="es-ES_tradnl" w:bidi="ar-SA"/>
-        </w:rPr>
-        <w:t>Contenido</w:t>
-      </w:r>
-      <w:r>
-        <w:rPr>
-          <w:color w:val="auto"/>
-          <w:lang w:val="es-CR" w:eastAsia="es-ES_tradnl" w:bidi="ar-SA"/>
-        </w:rPr>
-        <w:t>)</w:t>
+        <w:t>(Contenido)</w:t>
       </w:r>
     </w:p>
     <w:p>
@@ -7534,10 +7880,12 @@
         <w:jc w:val="both"/>
         <w:rPr>
           <w:color w:val="auto"/>
-        </w:rPr>
-      </w:pPr>
-      <w:r>
-        <w:rPr>
+          <w:lang w:val="es-CR" w:eastAsia="es-ES_tradnl" w:bidi="ar-SA"/>
+        </w:rPr>
+      </w:pPr>
+      <w:r>
+        <w:rPr>
+          <w:color w:val="auto"/>
           <w:lang w:val="es-CR" w:eastAsia="es-ES_tradnl" w:bidi="ar-SA"/>
         </w:rPr>
       </w:r>
@@ -7557,9 +7905,9 @@
         <w:tblLook w:firstRow="0" w:noVBand="0" w:lastRow="0" w:firstColumn="0" w:lastColumn="0" w:noHBand="0" w:val="0000"/>
       </w:tblPr>
       <w:tblGrid>
-        <w:gridCol w:w="4199"/>
+        <w:gridCol w:w="4198"/>
         <w:gridCol w:w="1800"/>
-        <w:gridCol w:w="3361"/>
+        <w:gridCol w:w="3362"/>
       </w:tblGrid>
       <w:tr>
         <w:trPr>
@@ -7567,7 +7915,7 @@
         </w:trPr>
         <w:tc>
           <w:tcPr>
-            <w:tcW w:w="4199" w:type="dxa"/>
+            <w:tcW w:w="4198" w:type="dxa"/>
             <w:tcBorders>
               <w:top w:val="single" w:sz="4" w:space="0" w:color="AAAAAA"/>
               <w:left w:val="single" w:sz="4" w:space="0" w:color="AAAAAA"/>
@@ -7582,7 +7930,7 @@
               <w:pStyle w:val="Normal"/>
               <w:jc w:val="center"/>
               <w:rPr>
-                <w:color w:themeColor="text1" w:val="000000"/>
+                <w:lang w:val="es-CR" w:eastAsia="es-ES_tradnl" w:bidi="ar-SA"/>
               </w:rPr>
             </w:pPr>
             <w:r>
@@ -7592,6 +7940,7 @@
                 <w:color w:themeColor="text1" w:val="000000"/>
                 <w:sz w:val="20"/>
                 <w:szCs w:val="20"/>
+                <w:lang w:val="es-CR" w:eastAsia="es-ES_tradnl" w:bidi="ar-SA"/>
               </w:rPr>
               <w:t>Requerimiento</w:t>
             </w:r>
@@ -7614,7 +7963,7 @@
               <w:pStyle w:val="Normal"/>
               <w:jc w:val="center"/>
               <w:rPr>
-                <w:color w:themeColor="text1" w:val="000000"/>
+                <w:lang w:val="es-CR" w:eastAsia="es-ES_tradnl" w:bidi="ar-SA"/>
               </w:rPr>
             </w:pPr>
             <w:r>
@@ -7624,6 +7973,7 @@
                 <w:color w:themeColor="text1" w:val="000000"/>
                 <w:sz w:val="20"/>
                 <w:szCs w:val="20"/>
+                <w:lang w:val="es-CR" w:eastAsia="es-ES_tradnl" w:bidi="ar-SA"/>
               </w:rPr>
               <w:t>Estado</w:t>
             </w:r>
@@ -7631,7 +7981,7 @@
         </w:tc>
         <w:tc>
           <w:tcPr>
-            <w:tcW w:w="3361" w:type="dxa"/>
+            <w:tcW w:w="3362" w:type="dxa"/>
             <w:tcBorders>
               <w:top w:val="single" w:sz="4" w:space="0" w:color="AAAAAA"/>
               <w:left w:val="single" w:sz="4" w:space="0" w:color="AAAAAA"/>
@@ -7646,7 +7996,7 @@
               <w:pStyle w:val="Normal"/>
               <w:jc w:val="center"/>
               <w:rPr>
-                <w:color w:themeColor="text1" w:val="000000"/>
+                <w:lang w:val="es-CR" w:eastAsia="es-ES_tradnl" w:bidi="ar-SA"/>
               </w:rPr>
             </w:pPr>
             <w:r>
@@ -7656,6 +8006,7 @@
                 <w:color w:themeColor="text1" w:val="000000"/>
                 <w:sz w:val="20"/>
                 <w:szCs w:val="20"/>
+                <w:lang w:val="es-CR" w:eastAsia="es-ES_tradnl" w:bidi="ar-SA"/>
               </w:rPr>
               <w:t>Observaciones</w:t>
             </w:r>
@@ -7666,7 +8017,7 @@
         <w:trPr/>
         <w:tc>
           <w:tcPr>
-            <w:tcW w:w="4199" w:type="dxa"/>
+            <w:tcW w:w="4198" w:type="dxa"/>
             <w:tcBorders>
               <w:top w:val="single" w:sz="4" w:space="0" w:color="AAAAAA"/>
               <w:left w:val="single" w:sz="4" w:space="0" w:color="AAAAAA"/>
@@ -7679,7 +8030,7 @@
             <w:pPr>
               <w:pStyle w:val="Normal"/>
               <w:rPr>
-                <w:color w:themeColor="text1" w:val="000000"/>
+                <w:lang w:val="es-CR" w:eastAsia="es-ES_tradnl" w:bidi="ar-SA"/>
               </w:rPr>
             </w:pPr>
             <w:r>
@@ -7687,6 +8038,7 @@
                 <w:color w:themeColor="text1" w:val="000000"/>
                 <w:sz w:val="20"/>
                 <w:szCs w:val="20"/>
+                <w:lang w:val="es-CR" w:eastAsia="es-ES_tradnl" w:bidi="ar-SA"/>
               </w:rPr>
               <w:t>Generación aleatoria del número.</w:t>
             </w:r>
@@ -7707,7 +8059,7 @@
             <w:pPr>
               <w:pStyle w:val="Normal"/>
               <w:rPr>
-                <w:color w:themeColor="text1" w:val="000000"/>
+                <w:lang w:val="es-CR" w:eastAsia="es-ES_tradnl" w:bidi="ar-SA"/>
               </w:rPr>
             </w:pPr>
             <w:r>
@@ -7715,6 +8067,7 @@
                 <w:color w:themeColor="text1" w:val="000000"/>
                 <w:sz w:val="20"/>
                 <w:szCs w:val="20"/>
+                <w:lang w:val="es-CR" w:eastAsia="es-ES_tradnl" w:bidi="ar-SA"/>
               </w:rPr>
               <w:t>Completo</w:t>
             </w:r>
@@ -7722,7 +8075,7 @@
         </w:tc>
         <w:tc>
           <w:tcPr>
-            <w:tcW w:w="3361" w:type="dxa"/>
+            <w:tcW w:w="3362" w:type="dxa"/>
             <w:tcBorders>
               <w:top w:val="single" w:sz="4" w:space="0" w:color="AAAAAA"/>
               <w:left w:val="single" w:sz="4" w:space="0" w:color="AAAAAA"/>
@@ -7735,7 +8088,7 @@
             <w:pPr>
               <w:pStyle w:val="Normal"/>
               <w:rPr>
-                <w:color w:themeColor="text1" w:val="000000"/>
+                <w:lang w:val="es-CR" w:eastAsia="es-ES_tradnl" w:bidi="ar-SA"/>
               </w:rPr>
             </w:pPr>
             <w:r>
@@ -7743,6 +8096,7 @@
                 <w:color w:themeColor="text1" w:val="000000"/>
                 <w:sz w:val="20"/>
                 <w:szCs w:val="20"/>
+                <w:lang w:val="es-CR" w:eastAsia="es-ES_tradnl" w:bidi="ar-SA"/>
               </w:rPr>
               <w:t>Se usa random.randint() para crear un número al azar.</w:t>
             </w:r>
@@ -7753,7 +8107,7 @@
         <w:trPr/>
         <w:tc>
           <w:tcPr>
-            <w:tcW w:w="4199" w:type="dxa"/>
+            <w:tcW w:w="4198" w:type="dxa"/>
             <w:tcBorders>
               <w:top w:val="single" w:sz="4" w:space="0" w:color="AAAAAA"/>
               <w:left w:val="single" w:sz="4" w:space="0" w:color="AAAAAA"/>
@@ -7766,7 +8120,7 @@
             <w:pPr>
               <w:pStyle w:val="Normal"/>
               <w:rPr>
-                <w:color w:themeColor="text1" w:val="000000"/>
+                <w:lang w:val="es-CR" w:eastAsia="es-ES_tradnl" w:bidi="ar-SA"/>
               </w:rPr>
             </w:pPr>
             <w:r>
@@ -7774,6 +8128,7 @@
                 <w:color w:themeColor="text1" w:val="000000"/>
                 <w:sz w:val="20"/>
                 <w:szCs w:val="20"/>
+                <w:lang w:val="es-CR" w:eastAsia="es-ES_tradnl" w:bidi="ar-SA"/>
               </w:rPr>
               <w:t>Crear una lista de número erróneos</w:t>
             </w:r>
@@ -7794,7 +8149,7 @@
             <w:pPr>
               <w:pStyle w:val="Normal"/>
               <w:rPr>
-                <w:color w:themeColor="text1" w:val="000000"/>
+                <w:lang w:val="es-CR" w:eastAsia="es-ES_tradnl" w:bidi="ar-SA"/>
               </w:rPr>
             </w:pPr>
             <w:r>
@@ -7802,6 +8157,7 @@
                 <w:color w:themeColor="text1" w:val="000000"/>
                 <w:sz w:val="20"/>
                 <w:szCs w:val="20"/>
+                <w:lang w:val="es-CR" w:eastAsia="es-ES_tradnl" w:bidi="ar-SA"/>
               </w:rPr>
               <w:t>Completo</w:t>
             </w:r>
@@ -7809,7 +8165,7 @@
         </w:tc>
         <w:tc>
           <w:tcPr>
-            <w:tcW w:w="3361" w:type="dxa"/>
+            <w:tcW w:w="3362" w:type="dxa"/>
             <w:tcBorders>
               <w:top w:val="single" w:sz="4" w:space="0" w:color="AAAAAA"/>
               <w:left w:val="single" w:sz="4" w:space="0" w:color="AAAAAA"/>
@@ -7822,7 +8178,7 @@
             <w:pPr>
               <w:pStyle w:val="Normal"/>
               <w:rPr>
-                <w:color w:themeColor="text1" w:val="000000"/>
+                <w:lang w:val="es-CR" w:eastAsia="es-ES_tradnl" w:bidi="ar-SA"/>
               </w:rPr>
             </w:pPr>
             <w:r>
@@ -7830,6 +8186,7 @@
                 <w:color w:themeColor="text1" w:val="000000"/>
                 <w:sz w:val="20"/>
                 <w:szCs w:val="20"/>
+                <w:lang w:val="es-CR" w:eastAsia="es-ES_tradnl" w:bidi="ar-SA"/>
               </w:rPr>
               <w:t>Se crea una lista vacía en donde se añadía los valores que el jugador iba probando.</w:t>
             </w:r>
@@ -7840,7 +8197,7 @@
         <w:trPr/>
         <w:tc>
           <w:tcPr>
-            <w:tcW w:w="4199" w:type="dxa"/>
+            <w:tcW w:w="4198" w:type="dxa"/>
             <w:tcBorders>
               <w:top w:val="single" w:sz="4" w:space="0" w:color="AAAAAA"/>
               <w:left w:val="single" w:sz="4" w:space="0" w:color="AAAAAA"/>
@@ -7853,7 +8210,7 @@
             <w:pPr>
               <w:pStyle w:val="Normal"/>
               <w:rPr>
-                <w:color w:themeColor="text1" w:val="000000"/>
+                <w:lang w:val="es-CR" w:eastAsia="es-ES_tradnl" w:bidi="ar-SA"/>
               </w:rPr>
             </w:pPr>
             <w:r>
@@ -7861,6 +8218,7 @@
                 <w:color w:themeColor="text1" w:val="000000"/>
                 <w:sz w:val="20"/>
                 <w:szCs w:val="20"/>
+                <w:lang w:val="es-CR" w:eastAsia="es-ES_tradnl" w:bidi="ar-SA"/>
               </w:rPr>
               <w:t>Validación de número ingresado.</w:t>
             </w:r>
@@ -7881,7 +8239,7 @@
             <w:pPr>
               <w:pStyle w:val="Normal"/>
               <w:rPr>
-                <w:color w:themeColor="text1" w:val="000000"/>
+                <w:lang w:val="es-CR" w:eastAsia="es-ES_tradnl" w:bidi="ar-SA"/>
               </w:rPr>
             </w:pPr>
             <w:r>
@@ -7889,6 +8247,7 @@
                 <w:color w:themeColor="text1" w:val="000000"/>
                 <w:sz w:val="20"/>
                 <w:szCs w:val="20"/>
+                <w:lang w:val="es-CR" w:eastAsia="es-ES_tradnl" w:bidi="ar-SA"/>
               </w:rPr>
               <w:t>Completo</w:t>
             </w:r>
@@ -7896,7 +8255,7 @@
         </w:tc>
         <w:tc>
           <w:tcPr>
-            <w:tcW w:w="3361" w:type="dxa"/>
+            <w:tcW w:w="3362" w:type="dxa"/>
             <w:tcBorders>
               <w:top w:val="single" w:sz="4" w:space="0" w:color="AAAAAA"/>
               <w:left w:val="single" w:sz="4" w:space="0" w:color="AAAAAA"/>
@@ -7909,7 +8268,7 @@
             <w:pPr>
               <w:pStyle w:val="Normal"/>
               <w:rPr>
-                <w:color w:themeColor="text1" w:val="000000"/>
+                <w:lang w:val="es-CR" w:eastAsia="es-ES_tradnl" w:bidi="ar-SA"/>
               </w:rPr>
             </w:pPr>
             <w:r>
@@ -7917,6 +8276,7 @@
                 <w:color w:themeColor="text1" w:val="000000"/>
                 <w:sz w:val="20"/>
                 <w:szCs w:val="20"/>
+                <w:lang w:val="es-CR" w:eastAsia="es-ES_tradnl" w:bidi="ar-SA"/>
               </w:rPr>
               <w:t>La función número_es_incorrecto() revisa los valores ingresados y en caso de introducir un valor no válido repite la acción hasta ingresar un número válido.</w:t>
             </w:r>
@@ -7927,7 +8287,7 @@
         <w:trPr/>
         <w:tc>
           <w:tcPr>
-            <w:tcW w:w="4199" w:type="dxa"/>
+            <w:tcW w:w="4198" w:type="dxa"/>
             <w:tcBorders>
               <w:top w:val="single" w:sz="4" w:space="0" w:color="AAAAAA"/>
               <w:left w:val="single" w:sz="4" w:space="0" w:color="AAAAAA"/>
@@ -7940,7 +8300,7 @@
             <w:pPr>
               <w:pStyle w:val="Normal"/>
               <w:rPr>
-                <w:color w:themeColor="text1" w:val="000000"/>
+                <w:lang w:val="es-CR" w:eastAsia="es-ES_tradnl" w:bidi="ar-SA"/>
               </w:rPr>
             </w:pPr>
             <w:r>
@@ -7948,6 +8308,7 @@
                 <w:color w:themeColor="text1" w:val="000000"/>
                 <w:sz w:val="20"/>
                 <w:szCs w:val="20"/>
+                <w:lang w:val="es-CR" w:eastAsia="es-ES_tradnl" w:bidi="ar-SA"/>
               </w:rPr>
               <w:t>Ignorar números mayores a cien y menores que cero</w:t>
             </w:r>
@@ -7968,7 +8329,7 @@
             <w:pPr>
               <w:pStyle w:val="Normal"/>
               <w:rPr>
-                <w:color w:themeColor="text1" w:val="000000"/>
+                <w:lang w:val="es-CR" w:eastAsia="es-ES_tradnl" w:bidi="ar-SA"/>
               </w:rPr>
             </w:pPr>
             <w:r>
@@ -7976,6 +8337,7 @@
                 <w:color w:themeColor="text1" w:val="000000"/>
                 <w:sz w:val="20"/>
                 <w:szCs w:val="20"/>
+                <w:lang w:val="es-CR" w:eastAsia="es-ES_tradnl" w:bidi="ar-SA"/>
               </w:rPr>
               <w:t>Completo</w:t>
             </w:r>
@@ -7983,7 +8345,7 @@
         </w:tc>
         <w:tc>
           <w:tcPr>
-            <w:tcW w:w="3361" w:type="dxa"/>
+            <w:tcW w:w="3362" w:type="dxa"/>
             <w:tcBorders>
               <w:top w:val="single" w:sz="4" w:space="0" w:color="AAAAAA"/>
               <w:left w:val="single" w:sz="4" w:space="0" w:color="AAAAAA"/>
@@ -7996,7 +8358,7 @@
             <w:pPr>
               <w:pStyle w:val="Normal"/>
               <w:rPr>
-                <w:color w:themeColor="text1" w:val="000000"/>
+                <w:lang w:val="es-CR" w:eastAsia="es-ES_tradnl" w:bidi="ar-SA"/>
               </w:rPr>
             </w:pPr>
             <w:r>
@@ -8004,6 +8366,7 @@
                 <w:color w:themeColor="text1" w:val="000000"/>
                 <w:sz w:val="20"/>
                 <w:szCs w:val="20"/>
+                <w:lang w:val="es-CR" w:eastAsia="es-ES_tradnl" w:bidi="ar-SA"/>
               </w:rPr>
               <w:t>Se compara el valor con un if, se notifica y se repite la acción hasta ingresar un número válido.</w:t>
             </w:r>
@@ -8014,7 +8377,7 @@
         <w:trPr/>
         <w:tc>
           <w:tcPr>
-            <w:tcW w:w="4199" w:type="dxa"/>
+            <w:tcW w:w="4198" w:type="dxa"/>
             <w:tcBorders>
               <w:top w:val="single" w:sz="4" w:space="0" w:color="AAAAAA"/>
               <w:left w:val="single" w:sz="4" w:space="0" w:color="AAAAAA"/>
@@ -8027,7 +8390,7 @@
             <w:pPr>
               <w:pStyle w:val="Normal"/>
               <w:rPr>
-                <w:color w:themeColor="text1" w:val="000000"/>
+                <w:lang w:val="es-CR" w:eastAsia="es-ES_tradnl" w:bidi="ar-SA"/>
               </w:rPr>
             </w:pPr>
             <w:r>
@@ -8035,6 +8398,7 @@
                 <w:color w:themeColor="text1" w:val="000000"/>
                 <w:sz w:val="20"/>
                 <w:szCs w:val="20"/>
+                <w:lang w:val="es-CR" w:eastAsia="es-ES_tradnl" w:bidi="ar-SA"/>
               </w:rPr>
               <w:t>Añadir número erróneo a la lista y mostrar dicha lista</w:t>
             </w:r>
@@ -8055,7 +8419,7 @@
             <w:pPr>
               <w:pStyle w:val="Normal"/>
               <w:rPr>
-                <w:color w:themeColor="text1" w:val="000000"/>
+                <w:lang w:val="es-CR" w:eastAsia="es-ES_tradnl" w:bidi="ar-SA"/>
               </w:rPr>
             </w:pPr>
             <w:r>
@@ -8063,6 +8427,7 @@
                 <w:color w:themeColor="text1" w:val="000000"/>
                 <w:sz w:val="20"/>
                 <w:szCs w:val="20"/>
+                <w:lang w:val="es-CR" w:eastAsia="es-ES_tradnl" w:bidi="ar-SA"/>
               </w:rPr>
               <w:t>Completo</w:t>
             </w:r>
@@ -8070,7 +8435,7 @@
         </w:tc>
         <w:tc>
           <w:tcPr>
-            <w:tcW w:w="3361" w:type="dxa"/>
+            <w:tcW w:w="3362" w:type="dxa"/>
             <w:tcBorders>
               <w:top w:val="single" w:sz="4" w:space="0" w:color="AAAAAA"/>
               <w:left w:val="single" w:sz="4" w:space="0" w:color="AAAAAA"/>
@@ -8083,7 +8448,7 @@
             <w:pPr>
               <w:pStyle w:val="Normal"/>
               <w:rPr>
-                <w:color w:themeColor="text1" w:val="000000"/>
+                <w:lang w:val="es-CR" w:eastAsia="es-ES_tradnl" w:bidi="ar-SA"/>
               </w:rPr>
             </w:pPr>
             <w:r>
@@ -8091,6 +8456,7 @@
                 <w:color w:themeColor="text1" w:val="000000"/>
                 <w:sz w:val="20"/>
                 <w:szCs w:val="20"/>
+                <w:lang w:val="es-CR" w:eastAsia="es-ES_tradnl" w:bidi="ar-SA"/>
               </w:rPr>
               <w:t>Si el número ingresado no es el número secreto se añade a la lista mediante un .append y luego se muestra mediante un print en cada turno.</w:t>
             </w:r>
@@ -8101,7 +8467,7 @@
         <w:trPr/>
         <w:tc>
           <w:tcPr>
-            <w:tcW w:w="4199" w:type="dxa"/>
+            <w:tcW w:w="4198" w:type="dxa"/>
             <w:tcBorders>
               <w:top w:val="single" w:sz="4" w:space="0" w:color="AAAAAA"/>
               <w:left w:val="single" w:sz="4" w:space="0" w:color="AAAAAA"/>
@@ -8114,7 +8480,7 @@
             <w:pPr>
               <w:pStyle w:val="Normal"/>
               <w:rPr>
-                <w:color w:themeColor="text1" w:val="000000"/>
+                <w:lang w:val="es-CR" w:eastAsia="es-ES_tradnl" w:bidi="ar-SA"/>
               </w:rPr>
             </w:pPr>
             <w:r>
@@ -8122,6 +8488,7 @@
                 <w:color w:themeColor="text1" w:val="000000"/>
                 <w:sz w:val="20"/>
                 <w:szCs w:val="20"/>
+                <w:lang w:val="es-CR" w:eastAsia="es-ES_tradnl" w:bidi="ar-SA"/>
               </w:rPr>
               <w:t>Resta de intentos</w:t>
             </w:r>
@@ -8142,7 +8509,7 @@
             <w:pPr>
               <w:pStyle w:val="Normal"/>
               <w:rPr>
-                <w:color w:themeColor="text1" w:val="000000"/>
+                <w:lang w:val="es-CR" w:eastAsia="es-ES_tradnl" w:bidi="ar-SA"/>
               </w:rPr>
             </w:pPr>
             <w:r>
@@ -8150,6 +8517,7 @@
                 <w:color w:themeColor="text1" w:val="000000"/>
                 <w:sz w:val="20"/>
                 <w:szCs w:val="20"/>
+                <w:lang w:val="es-CR" w:eastAsia="es-ES_tradnl" w:bidi="ar-SA"/>
               </w:rPr>
               <w:t>Completo</w:t>
             </w:r>
@@ -8157,7 +8525,7 @@
         </w:tc>
         <w:tc>
           <w:tcPr>
-            <w:tcW w:w="3361" w:type="dxa"/>
+            <w:tcW w:w="3362" w:type="dxa"/>
             <w:tcBorders>
               <w:top w:val="single" w:sz="4" w:space="0" w:color="AAAAAA"/>
               <w:left w:val="single" w:sz="4" w:space="0" w:color="AAAAAA"/>
@@ -8170,7 +8538,7 @@
             <w:pPr>
               <w:pStyle w:val="Normal"/>
               <w:rPr>
-                <w:color w:themeColor="text1" w:val="000000"/>
+                <w:lang w:val="es-CR" w:eastAsia="es-ES_tradnl" w:bidi="ar-SA"/>
               </w:rPr>
             </w:pPr>
             <w:r>
@@ -8178,6 +8546,7 @@
                 <w:color w:themeColor="text1" w:val="000000"/>
                 <w:sz w:val="20"/>
                 <w:szCs w:val="20"/>
+                <w:lang w:val="es-CR" w:eastAsia="es-ES_tradnl" w:bidi="ar-SA"/>
               </w:rPr>
               <w:t>Si el número es válido, pero no es el número secreto se le resta un intento.</w:t>
             </w:r>
@@ -8188,7 +8557,7 @@
         <w:trPr/>
         <w:tc>
           <w:tcPr>
-            <w:tcW w:w="4199" w:type="dxa"/>
+            <w:tcW w:w="4198" w:type="dxa"/>
             <w:tcBorders>
               <w:top w:val="single" w:sz="4" w:space="0" w:color="AAAAAA"/>
               <w:left w:val="single" w:sz="4" w:space="0" w:color="AAAAAA"/>
@@ -8201,7 +8570,7 @@
             <w:pPr>
               <w:pStyle w:val="Normal"/>
               <w:rPr>
-                <w:color w:themeColor="text1" w:val="000000"/>
+                <w:lang w:val="es-CR" w:eastAsia="es-ES_tradnl" w:bidi="ar-SA"/>
               </w:rPr>
             </w:pPr>
             <w:r>
@@ -8209,6 +8578,7 @@
                 <w:color w:themeColor="text1" w:val="000000"/>
                 <w:sz w:val="20"/>
                 <w:szCs w:val="20"/>
+                <w:lang w:val="es-CR" w:eastAsia="es-ES_tradnl" w:bidi="ar-SA"/>
               </w:rPr>
               <w:t>Máximo 7 intentos antes de perder</w:t>
             </w:r>
@@ -8229,7 +8599,7 @@
             <w:pPr>
               <w:pStyle w:val="Normal"/>
               <w:rPr>
-                <w:color w:themeColor="text1" w:val="000000"/>
+                <w:lang w:val="es-CR" w:eastAsia="es-ES_tradnl" w:bidi="ar-SA"/>
               </w:rPr>
             </w:pPr>
             <w:r>
@@ -8237,6 +8607,7 @@
                 <w:color w:themeColor="text1" w:val="000000"/>
                 <w:sz w:val="20"/>
                 <w:szCs w:val="20"/>
+                <w:lang w:val="es-CR" w:eastAsia="es-ES_tradnl" w:bidi="ar-SA"/>
               </w:rPr>
               <w:t>Completo</w:t>
             </w:r>
@@ -8244,7 +8615,7 @@
         </w:tc>
         <w:tc>
           <w:tcPr>
-            <w:tcW w:w="3361" w:type="dxa"/>
+            <w:tcW w:w="3362" w:type="dxa"/>
             <w:tcBorders>
               <w:top w:val="single" w:sz="4" w:space="0" w:color="AAAAAA"/>
               <w:left w:val="single" w:sz="4" w:space="0" w:color="AAAAAA"/>
@@ -8257,7 +8628,7 @@
             <w:pPr>
               <w:pStyle w:val="Normal"/>
               <w:rPr>
-                <w:color w:themeColor="text1" w:val="000000"/>
+                <w:lang w:val="es-CR" w:eastAsia="es-ES_tradnl" w:bidi="ar-SA"/>
               </w:rPr>
             </w:pPr>
             <w:r>
@@ -8265,6 +8636,7 @@
                 <w:color w:themeColor="text1" w:val="000000"/>
                 <w:sz w:val="20"/>
                 <w:szCs w:val="20"/>
+                <w:lang w:val="es-CR" w:eastAsia="es-ES_tradnl" w:bidi="ar-SA"/>
               </w:rPr>
               <w:t>Controlado por un if en la función adivinar() que si se cumple llama a la función sin_intentos().</w:t>
             </w:r>
@@ -8275,7 +8647,7 @@
         <w:trPr/>
         <w:tc>
           <w:tcPr>
-            <w:tcW w:w="4199" w:type="dxa"/>
+            <w:tcW w:w="4198" w:type="dxa"/>
             <w:tcBorders>
               <w:top w:val="single" w:sz="4" w:space="0" w:color="AAAAAA"/>
               <w:left w:val="single" w:sz="4" w:space="0" w:color="AAAAAA"/>
@@ -8288,7 +8660,7 @@
             <w:pPr>
               <w:pStyle w:val="Normal"/>
               <w:rPr>
-                <w:color w:themeColor="text1" w:val="000000"/>
+                <w:lang w:val="es-CR" w:eastAsia="es-ES_tradnl" w:bidi="ar-SA"/>
               </w:rPr>
             </w:pPr>
             <w:r>
@@ -8296,6 +8668,7 @@
                 <w:color w:themeColor="text1" w:val="000000"/>
                 <w:sz w:val="20"/>
                 <w:szCs w:val="20"/>
+                <w:lang w:val="es-CR" w:eastAsia="es-ES_tradnl" w:bidi="ar-SA"/>
               </w:rPr>
               <w:t>Mostrar el número si se pierde</w:t>
             </w:r>
@@ -8316,7 +8689,7 @@
             <w:pPr>
               <w:pStyle w:val="Normal"/>
               <w:rPr>
-                <w:color w:themeColor="text1" w:val="000000"/>
+                <w:lang w:val="es-CR" w:eastAsia="es-ES_tradnl" w:bidi="ar-SA"/>
               </w:rPr>
             </w:pPr>
             <w:r>
@@ -8324,6 +8697,7 @@
                 <w:color w:themeColor="text1" w:val="000000"/>
                 <w:sz w:val="20"/>
                 <w:szCs w:val="20"/>
+                <w:lang w:val="es-CR" w:eastAsia="es-ES_tradnl" w:bidi="ar-SA"/>
               </w:rPr>
               <w:t>Completo</w:t>
             </w:r>
@@ -8331,7 +8705,7 @@
         </w:tc>
         <w:tc>
           <w:tcPr>
-            <w:tcW w:w="3361" w:type="dxa"/>
+            <w:tcW w:w="3362" w:type="dxa"/>
             <w:tcBorders>
               <w:top w:val="single" w:sz="4" w:space="0" w:color="AAAAAA"/>
               <w:left w:val="single" w:sz="4" w:space="0" w:color="AAAAAA"/>
@@ -8344,7 +8718,7 @@
             <w:pPr>
               <w:pStyle w:val="Normal"/>
               <w:rPr>
-                <w:color w:themeColor="text1" w:val="000000"/>
+                <w:lang w:val="es-CR" w:eastAsia="es-ES_tradnl" w:bidi="ar-SA"/>
               </w:rPr>
             </w:pPr>
             <w:r>
@@ -8352,6 +8726,7 @@
                 <w:color w:themeColor="text1" w:val="000000"/>
                 <w:sz w:val="20"/>
                 <w:szCs w:val="20"/>
+                <w:lang w:val="es-CR" w:eastAsia="es-ES_tradnl" w:bidi="ar-SA"/>
               </w:rPr>
               <w:t>Se imprime número_secreto cuando se terminan los intentos.</w:t>
             </w:r>
@@ -8366,10 +8741,12 @@
         <w:jc w:val="both"/>
         <w:rPr>
           <w:color w:val="auto"/>
-        </w:rPr>
-      </w:pPr>
-      <w:r>
-        <w:rPr>
+          <w:lang w:val="es-CR" w:eastAsia="es-ES_tradnl" w:bidi="ar-SA"/>
+        </w:rPr>
+      </w:pPr>
+      <w:r>
+        <w:rPr>
+          <w:color w:val="auto"/>
           <w:lang w:val="es-CR" w:eastAsia="es-ES_tradnl" w:bidi="ar-SA"/>
         </w:rPr>
       </w:r>
@@ -9458,55 +9835,50 @@
         </w:rPr>
         <w:t xml:space="preserve">PEP 8 — Style Guide for Python Code. (2001). Python Enhancement Proposals. Recuperado el 7 de abril de 2026, de </w:t>
       </w:r>
-      <w:hyperlink r:id="rId6">
+      <w:r>
+        <w:rPr>
+          <w:rStyle w:val="Hyperlink"/>
+          <w:color w:val="auto"/>
+          <w:lang w:val="es-CR" w:eastAsia="es-ES_tradnl" w:bidi="ar-SA"/>
+        </w:rPr>
+        <w:t>https://peps.python.org/pep-0008/</w:t>
+      </w:r>
+    </w:p>
+    <w:p>
+      <w:pPr>
+        <w:pStyle w:val="Normal"/>
+        <w:spacing w:before="0" w:after="120"/>
+        <w:jc w:val="both"/>
+        <w:rPr>
+          <w:color w:val="auto"/>
+          <w:lang w:val="es-CR" w:eastAsia="es-ES_tradnl" w:bidi="ar-SA"/>
+        </w:rPr>
+      </w:pPr>
+      <w:r>
+        <w:rPr>
+          <w:color w:val="auto"/>
+          <w:lang w:val="es-CR" w:eastAsia="es-ES_tradnl" w:bidi="ar-SA"/>
+        </w:rPr>
+      </w:r>
+    </w:p>
+    <w:p>
+      <w:pPr>
+        <w:pStyle w:val="Normal"/>
+        <w:spacing w:before="0" w:after="120"/>
+        <w:jc w:val="both"/>
+        <w:rPr/>
+      </w:pPr>
+      <w:r>
+        <w:rPr>
+          <w:lang w:val="es-CR" w:eastAsia="es-ES_tradnl" w:bidi="ar-SA"/>
+        </w:rPr>
+        <w:t xml:space="preserve">w3schools (s. f) “Método isdigit() de cadena de Python”. Recuperado de </w:t>
+      </w:r>
+      <w:hyperlink r:id="rId5">
         <w:r>
           <w:rPr>
             <w:rStyle w:val="Hyperlink"/>
-            <w:color w:val="auto"/>
             <w:lang w:val="es-CR" w:eastAsia="es-ES_tradnl" w:bidi="ar-SA"/>
-          </w:rPr>
-          <w:t>https://peps.python.org/pep-0008/</w:t>
-        </w:r>
-      </w:hyperlink>
-    </w:p>
-    <w:p>
-      <w:pPr>
-        <w:pStyle w:val="Normal"/>
-        <w:spacing w:before="0" w:after="120"/>
-        <w:jc w:val="both"/>
-        <w:rPr>
-          <w:rStyle w:val="Hyperlink"/>
-          <w:color w:val="auto"/>
-          <w:lang w:val="es-CR" w:eastAsia="es-ES_tradnl" w:bidi="ar-SA"/>
-        </w:rPr>
-      </w:pPr>
-      <w:r>
-        <w:rPr/>
-      </w:r>
-    </w:p>
-    <w:p>
-      <w:pPr>
-        <w:pStyle w:val="Normal"/>
-        <w:spacing w:before="0" w:after="120"/>
-        <w:jc w:val="both"/>
-        <w:rPr/>
-      </w:pPr>
-      <w:r>
-        <w:rPr/>
-        <w:t xml:space="preserve">w3schools (s. f) “Método isdigit() de cadena de Python”. Recuperado </w:t>
-      </w:r>
-      <w:r>
-        <w:rPr/>
-        <w:t>de</w:t>
-      </w:r>
-      <w:r>
-        <w:rPr/>
-        <w:t xml:space="preserve"> </w:t>
-      </w:r>
-      <w:hyperlink r:id="rId7">
-        <w:r>
-          <w:rPr>
-            <w:rStyle w:val="Hyperlink"/>
           </w:rPr>
           <w:t>https://www.w3schools.com/python/ref_string_isdigit.asp</w:t>
         </w:r>

</xml_diff>

<commit_message>
Unos Cambios Pequeñitos Pero Importantes
En el último commit se subió una actualización de la documenatción externa que traía información repetida a modo de "placeholder" en la sección 2.3.1, ya se corrigió.
</commit_message>
<xml_diff>
--- a/Documentación Externa del Proyecto.docx
+++ b/Documentación Externa del Proyecto.docx
@@ -2821,7 +2821,7 @@
           <w:color w:val="auto"/>
           <w:lang w:val="es-CR" w:eastAsia="es-ES_tradnl" w:bidi="ar-SA"/>
         </w:rPr>
-        <w:t>Escoger una palabra al azar de una lista que ya está en el programa.</w:t>
+        <w:t>El programa debe elegir una palabra al azar de una lista y desordenar sus letras.</w:t>
       </w:r>
     </w:p>
     <w:p>
@@ -2841,7 +2841,7 @@
           <w:color w:val="auto"/>
           <w:lang w:val="es-CR" w:eastAsia="es-ES_tradnl" w:bidi="ar-SA"/>
         </w:rPr>
-        <w:t>Mostrarle al jugador cuántas letras tiene la palabra, usando guiones bajos en lugar de las letras.</w:t>
+        <w:t>El programa permite adivinar la palabra.</w:t>
       </w:r>
     </w:p>
     <w:p>
@@ -2861,7 +2861,7 @@
           <w:color w:val="auto"/>
           <w:lang w:val="es-CR" w:eastAsia="es-ES_tradnl" w:bidi="ar-SA"/>
         </w:rPr>
-        <w:t>Pedirle al jugador que ingrese una letra, sin importar si la escribe en mayúscula o minúscula.</w:t>
+        <w:t>Si el jugador acierta, se muestra un mensaje felicitando.</w:t>
       </w:r>
     </w:p>
     <w:p>
@@ -2881,67 +2881,7 @@
           <w:color w:val="auto"/>
           <w:lang w:val="es-CR" w:eastAsia="es-ES_tradnl" w:bidi="ar-SA"/>
         </w:rPr>
-        <w:t>Si la letra está en la palabra, mostrarla en todas las posiciones donde aparece.</w:t>
-      </w:r>
-    </w:p>
-    <w:p>
-      <w:pPr>
-        <w:pStyle w:val="ListParagraph"/>
-        <w:numPr>
-          <w:ilvl w:val="0"/>
-          <w:numId w:val="1"/>
-        </w:numPr>
-        <w:spacing w:before="0" w:after="60"/>
-        <w:rPr>
-          <w:lang w:val="es-CR" w:eastAsia="es-ES_tradnl" w:bidi="ar-SA"/>
-        </w:rPr>
-      </w:pPr>
-      <w:r>
-        <w:rPr>
-          <w:color w:val="auto"/>
-          <w:lang w:val="es-CR" w:eastAsia="es-ES_tradnl" w:bidi="ar-SA"/>
-        </w:rPr>
-        <w:t>Si la letra no está, agregarla a la lista de letras ya usadas y dibujar una parte del cuerpo del ahorcado.</w:t>
-      </w:r>
-    </w:p>
-    <w:p>
-      <w:pPr>
-        <w:pStyle w:val="ListParagraph"/>
-        <w:numPr>
-          <w:ilvl w:val="0"/>
-          <w:numId w:val="1"/>
-        </w:numPr>
-        <w:spacing w:before="0" w:after="60"/>
-        <w:rPr>
-          <w:lang w:val="es-CR" w:eastAsia="es-ES_tradnl" w:bidi="ar-SA"/>
-        </w:rPr>
-      </w:pPr>
-      <w:r>
-        <w:rPr>
-          <w:color w:val="auto"/>
-          <w:lang w:val="es-CR" w:eastAsia="es-ES_tradnl" w:bidi="ar-SA"/>
-        </w:rPr>
-        <w:t>El jugador tiene máximo 7 errores antes de perder. Si los agota, se revela la palabra.</w:t>
-      </w:r>
-    </w:p>
-    <w:p>
-      <w:pPr>
-        <w:pStyle w:val="ListParagraph"/>
-        <w:numPr>
-          <w:ilvl w:val="0"/>
-          <w:numId w:val="1"/>
-        </w:numPr>
-        <w:spacing w:before="0" w:after="60"/>
-        <w:rPr>
-          <w:lang w:val="es-CR" w:eastAsia="es-ES_tradnl" w:bidi="ar-SA"/>
-        </w:rPr>
-      </w:pPr>
-      <w:r>
-        <w:rPr>
-          <w:color w:val="auto"/>
-          <w:lang w:val="es-CR" w:eastAsia="es-ES_tradnl" w:bidi="ar-SA"/>
-        </w:rPr>
-        <w:t>Si el jugador adivina todas las letras antes de llegar a 7 errores, gana.</w:t>
+        <w:t>Se permite intentar 3 veces antes de dar el juego por perdido.</w:t>
       </w:r>
     </w:p>
     <w:p>
@@ -2983,7 +2923,14 @@
           <w:color w:val="auto"/>
           <w:lang w:val="es-CR" w:eastAsia="es-ES_tradnl" w:bidi="ar-SA"/>
         </w:rPr>
-        <w:t>.1 Situaciones en las que se puede complicar</w:t>
+        <w:t xml:space="preserve">.1 </w:t>
+      </w:r>
+      <w:r>
+        <w:rPr>
+          <w:color w:val="auto"/>
+          <w:lang w:val="es-CR" w:eastAsia="es-ES_tradnl" w:bidi="ar-SA"/>
+        </w:rPr>
+        <w:t>Puntos importantes a considerar</w:t>
       </w:r>
     </w:p>
     <w:p>
@@ -3000,7 +2947,7 @@
           <w:color w:val="auto"/>
           <w:lang w:val="es-CR" w:eastAsia="es-ES_tradnl" w:bidi="ar-SA"/>
         </w:rPr>
-        <w:t>Más allá de lo básico, había algunas situaciones que era importante pensar desde antes para que el juego no fuera a fallar:</w:t>
+        <w:t>Algunos casos que deben de considerarse al programar el juego:</w:t>
       </w:r>
     </w:p>
     <w:p>
@@ -3036,7 +2983,14 @@
           <w:color w:val="auto"/>
           <w:lang w:val="es-CR" w:eastAsia="es-ES_tradnl" w:bidi="ar-SA"/>
         </w:rPr>
-        <w:t>¿Qué pasa si el jugador escribe dos letras juntas, o un número, o un símbolo? Hay que ignorar eso y volver a pedir una letra válida.</w:t>
+        <w:t>Se debe de crear una variable que almacene la palabra mezclada por aparte, ya que si se mez</w:t>
+      </w:r>
+      <w:r>
+        <w:rPr>
+          <w:color w:val="auto"/>
+          <w:lang w:val="es-CR" w:eastAsia="es-ES_tradnl" w:bidi="ar-SA"/>
+        </w:rPr>
+        <w:t>cla la palabra original el programa no podrá saber cual es la respuesta correcta.</w:t>
       </w:r>
     </w:p>
     <w:p>
@@ -3056,27 +3010,7 @@
           <w:color w:val="auto"/>
           <w:lang w:val="es-CR" w:eastAsia="es-ES_tradnl" w:bidi="ar-SA"/>
         </w:rPr>
-        <w:t>¿Qué pasa si repite una letra que ya usó antes? No debe contarse como error, solo hay que avisarle y pedirle que pruebe otra.</w:t>
-      </w:r>
-    </w:p>
-    <w:p>
-      <w:pPr>
-        <w:pStyle w:val="ListParagraph"/>
-        <w:numPr>
-          <w:ilvl w:val="0"/>
-          <w:numId w:val="2"/>
-        </w:numPr>
-        <w:spacing w:before="0" w:after="60"/>
-        <w:rPr>
-          <w:lang w:val="es-CR" w:eastAsia="es-ES_tradnl" w:bidi="ar-SA"/>
-        </w:rPr>
-      </w:pPr>
-      <w:r>
-        <w:rPr>
-          <w:color w:val="auto"/>
-          <w:lang w:val="es-CR" w:eastAsia="es-ES_tradnl" w:bidi="ar-SA"/>
-        </w:rPr>
-        <w:t>¿Qué pasa si adivina la última letra justo en el séptimo intento? Tiene que registrarse como victoria, no como derrota.</w:t>
+        <w:t>En caso de que la respuesta esté vacía el programa no debería de quitarle puntos al jugador. Principalmente porque no es posible que la respuesta correcta esté vacía y porque por lo general puede ser un dedaso.</w:t>
       </w:r>
     </w:p>
     <w:p>

</xml_diff>